<commit_message>
actualización sesión 13 febrero
</commit_message>
<xml_diff>
--- a/Semana_0/DES-FO-28  (2026).docx
+++ b/Semana_0/DES-FO-28  (2026).docx
@@ -4,7 +4,7 @@
   <w:body>
     <w:tbl>
       <w:tblPr>
-        <w:tblStyle w:val="Tablaconcuadrcula"/>
+        <w:tblStyle w:val="TableGrid"/>
         <w:tblW w:w="9356" w:type="dxa"/>
         <w:tblInd w:w="-142" w:type="dxa"/>
         <w:tblBorders>
@@ -439,7 +439,7 @@
         <mc:AlternateContent>
           <mc:Choice Requires="wps">
             <w:drawing>
-              <wp:anchor distT="0" distB="0" distL="114300" distR="114300" simplePos="0" relativeHeight="251661312" behindDoc="0" locked="0" layoutInCell="1" allowOverlap="1" wp14:anchorId="79A43AFD" wp14:editId="69540621">
+              <wp:anchor distT="0" distB="0" distL="114300" distR="114300" simplePos="0" relativeHeight="251658241" behindDoc="0" locked="0" layoutInCell="1" allowOverlap="1" wp14:anchorId="79A43AFD" wp14:editId="69540621">
                 <wp:simplePos x="0" y="0"/>
                 <wp:positionH relativeFrom="column">
                   <wp:posOffset>2034540</wp:posOffset>
@@ -494,9 +494,9 @@
               </wp:anchor>
             </w:drawing>
           </mc:Choice>
-          <mc:Fallback>
-            <w:pict>
-              <v:rect w14:anchorId="0104D4AE" id="Rectángulo 4" o:spid="_x0000_s1026" style="position:absolute;margin-left:160.2pt;margin-top:10.3pt;width:22.5pt;height:14.25pt;z-index:251661312;visibility:visible;mso-wrap-style:square;mso-wrap-distance-left:9pt;mso-wrap-distance-top:0;mso-wrap-distance-right:9pt;mso-wrap-distance-bottom:0;mso-position-horizontal:absolute;mso-position-horizontal-relative:text;mso-position-vertical:absolute;mso-position-vertical-relative:text;v-text-anchor:middle" o:gfxdata="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" filled="f" strokecolor="#1f4d78 [1604]" strokeweight="1pt"/>
+          <mc:Fallback xmlns:a14="http://schemas.microsoft.com/office/drawing/2010/main" xmlns:a="http://schemas.openxmlformats.org/drawingml/2006/main" xmlns:pic="http://schemas.openxmlformats.org/drawingml/2006/picture" xmlns:arto="http://schemas.microsoft.com/office/word/2006/arto">
+            <w:pict w14:anchorId="3F9BA15E">
+              <v:rect id="Rectángulo 4" style="position:absolute;margin-left:160.2pt;margin-top:10.3pt;width:22.5pt;height:14.25pt;z-index:251661312;visibility:visible;mso-wrap-style:square;mso-wrap-distance-left:9pt;mso-wrap-distance-top:0;mso-wrap-distance-right:9pt;mso-wrap-distance-bottom:0;mso-position-horizontal:absolute;mso-position-horizontal-relative:text;mso-position-vertical:absolute;mso-position-vertical-relative:text;v-text-anchor:middle" o:spid="_x0000_s1026" filled="f" strokecolor="#1f4d78 [1604]" strokeweight="1pt" w14:anchorId="0104D4AE" o:gfxdata="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"/>
             </w:pict>
           </mc:Fallback>
         </mc:AlternateContent>
@@ -510,7 +510,7 @@
         <mc:AlternateContent>
           <mc:Choice Requires="wps">
             <w:drawing>
-              <wp:anchor distT="0" distB="0" distL="114300" distR="114300" simplePos="0" relativeHeight="251659264" behindDoc="0" locked="0" layoutInCell="1" allowOverlap="1" wp14:anchorId="1388456B" wp14:editId="638CBD09">
+              <wp:anchor distT="0" distB="0" distL="114300" distR="114300" simplePos="0" relativeHeight="251658240" behindDoc="0" locked="0" layoutInCell="1" allowOverlap="1" wp14:anchorId="1388456B" wp14:editId="638CBD09">
                 <wp:simplePos x="0" y="0"/>
                 <wp:positionH relativeFrom="column">
                   <wp:posOffset>786765</wp:posOffset>
@@ -565,9 +565,9 @@
               </wp:anchor>
             </w:drawing>
           </mc:Choice>
-          <mc:Fallback>
-            <w:pict>
-              <v:rect w14:anchorId="3A204617" id="Rectángulo 3" o:spid="_x0000_s1026" style="position:absolute;margin-left:61.95pt;margin-top:11.05pt;width:22.5pt;height:14.25pt;z-index:251659264;visibility:visible;mso-wrap-style:square;mso-wrap-distance-left:9pt;mso-wrap-distance-top:0;mso-wrap-distance-right:9pt;mso-wrap-distance-bottom:0;mso-position-horizontal:absolute;mso-position-horizontal-relative:text;mso-position-vertical:absolute;mso-position-vertical-relative:text;v-text-anchor:middle" o:gfxdata="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" filled="f" strokecolor="#1f4d78 [1604]" strokeweight="1pt"/>
+          <mc:Fallback xmlns:a14="http://schemas.microsoft.com/office/drawing/2010/main" xmlns:a="http://schemas.openxmlformats.org/drawingml/2006/main" xmlns:pic="http://schemas.openxmlformats.org/drawingml/2006/picture" xmlns:arto="http://schemas.microsoft.com/office/word/2006/arto">
+            <w:pict w14:anchorId="5F2ECC3D">
+              <v:rect id="Rectángulo 3" style="position:absolute;margin-left:61.95pt;margin-top:11.05pt;width:22.5pt;height:14.25pt;z-index:251659264;visibility:visible;mso-wrap-style:square;mso-wrap-distance-left:9pt;mso-wrap-distance-top:0;mso-wrap-distance-right:9pt;mso-wrap-distance-bottom:0;mso-position-horizontal:absolute;mso-position-horizontal-relative:text;mso-position-vertical:absolute;mso-position-vertical-relative:text;v-text-anchor:middle" o:spid="_x0000_s1026" filled="f" strokecolor="#1f4d78 [1604]" strokeweight="1pt" w14:anchorId="3A204617" o:gfxdata="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"/>
             </w:pict>
           </mc:Fallback>
         </mc:AlternateContent>
@@ -588,7 +588,7 @@
         <mc:AlternateContent>
           <mc:Choice Requires="wps">
             <w:drawing>
-              <wp:anchor distT="0" distB="0" distL="114300" distR="114300" simplePos="0" relativeHeight="251665408" behindDoc="0" locked="0" layoutInCell="1" allowOverlap="1" wp14:anchorId="60910177" wp14:editId="4E6D6469">
+              <wp:anchor distT="0" distB="0" distL="114300" distR="114300" simplePos="0" relativeHeight="251658243" behindDoc="0" locked="0" layoutInCell="1" allowOverlap="1" wp14:anchorId="60910177" wp14:editId="4E6D6469">
                 <wp:simplePos x="0" y="0"/>
                 <wp:positionH relativeFrom="column">
                   <wp:posOffset>4953000</wp:posOffset>
@@ -643,9 +643,9 @@
               </wp:anchor>
             </w:drawing>
           </mc:Choice>
-          <mc:Fallback>
-            <w:pict>
-              <v:rect w14:anchorId="1FB80074" id="Rectángulo 6" o:spid="_x0000_s1026" style="position:absolute;margin-left:390pt;margin-top:1.95pt;width:22.5pt;height:14.25pt;z-index:251665408;visibility:visible;mso-wrap-style:square;mso-wrap-distance-left:9pt;mso-wrap-distance-top:0;mso-wrap-distance-right:9pt;mso-wrap-distance-bottom:0;mso-position-horizontal:absolute;mso-position-horizontal-relative:text;mso-position-vertical:absolute;mso-position-vertical-relative:text;v-text-anchor:middle" o:gfxdata="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" filled="f" strokecolor="#1f4d78 [1604]" strokeweight="1pt"/>
+          <mc:Fallback xmlns:a14="http://schemas.microsoft.com/office/drawing/2010/main" xmlns:a="http://schemas.openxmlformats.org/drawingml/2006/main" xmlns:pic="http://schemas.openxmlformats.org/drawingml/2006/picture" xmlns:arto="http://schemas.microsoft.com/office/word/2006/arto">
+            <w:pict w14:anchorId="4BD92379">
+              <v:rect id="Rectángulo 6" style="position:absolute;margin-left:390pt;margin-top:1.95pt;width:22.5pt;height:14.25pt;z-index:251665408;visibility:visible;mso-wrap-style:square;mso-wrap-distance-left:9pt;mso-wrap-distance-top:0;mso-wrap-distance-right:9pt;mso-wrap-distance-bottom:0;mso-position-horizontal:absolute;mso-position-horizontal-relative:text;mso-position-vertical:absolute;mso-position-vertical-relative:text;v-text-anchor:middle" o:spid="_x0000_s1026" filled="f" strokecolor="#1f4d78 [1604]" strokeweight="1pt" w14:anchorId="1FB80074" o:gfxdata="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"/>
             </w:pict>
           </mc:Fallback>
         </mc:AlternateContent>
@@ -659,7 +659,7 @@
         <mc:AlternateContent>
           <mc:Choice Requires="wps">
             <w:drawing>
-              <wp:anchor distT="0" distB="0" distL="114300" distR="114300" simplePos="0" relativeHeight="251663360" behindDoc="0" locked="0" layoutInCell="1" allowOverlap="1" wp14:anchorId="21F0FE46" wp14:editId="13BCDCE6">
+              <wp:anchor distT="0" distB="0" distL="114300" distR="114300" simplePos="0" relativeHeight="251658242" behindDoc="0" locked="0" layoutInCell="1" allowOverlap="1" wp14:anchorId="21F0FE46" wp14:editId="13BCDCE6">
                 <wp:simplePos x="0" y="0"/>
                 <wp:positionH relativeFrom="column">
                   <wp:posOffset>3505200</wp:posOffset>
@@ -714,9 +714,9 @@
               </wp:anchor>
             </w:drawing>
           </mc:Choice>
-          <mc:Fallback>
-            <w:pict>
-              <v:rect w14:anchorId="66DE37BB" id="Rectángulo 5" o:spid="_x0000_s1026" style="position:absolute;margin-left:276pt;margin-top:.7pt;width:22.5pt;height:14.25pt;z-index:251663360;visibility:visible;mso-wrap-style:square;mso-wrap-distance-left:9pt;mso-wrap-distance-top:0;mso-wrap-distance-right:9pt;mso-wrap-distance-bottom:0;mso-position-horizontal:absolute;mso-position-horizontal-relative:text;mso-position-vertical:absolute;mso-position-vertical-relative:text;v-text-anchor:middle" o:gfxdata="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" filled="f" strokecolor="#1f4d78 [1604]" strokeweight="1pt"/>
+          <mc:Fallback xmlns:a14="http://schemas.microsoft.com/office/drawing/2010/main" xmlns:a="http://schemas.openxmlformats.org/drawingml/2006/main" xmlns:pic="http://schemas.openxmlformats.org/drawingml/2006/picture" xmlns:arto="http://schemas.microsoft.com/office/word/2006/arto">
+            <w:pict w14:anchorId="53ED9EF3">
+              <v:rect id="Rectángulo 5" style="position:absolute;margin-left:276pt;margin-top:.7pt;width:22.5pt;height:14.25pt;z-index:251663360;visibility:visible;mso-wrap-style:square;mso-wrap-distance-left:9pt;mso-wrap-distance-top:0;mso-wrap-distance-right:9pt;mso-wrap-distance-bottom:0;mso-position-horizontal:absolute;mso-position-horizontal-relative:text;mso-position-vertical:absolute;mso-position-vertical-relative:text;v-text-anchor:middle" o:spid="_x0000_s1026" filled="f" strokecolor="#1f4d78 [1604]" strokeweight="1pt" w14:anchorId="66DE37BB" o:gfxdata="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"/>
             </w:pict>
           </mc:Fallback>
         </mc:AlternateContent>
@@ -819,7 +819,7 @@
         <mc:AlternateContent>
           <mc:Choice Requires="wps">
             <w:drawing>
-              <wp:anchor distT="0" distB="0" distL="114300" distR="114300" simplePos="0" relativeHeight="251671552" behindDoc="0" locked="0" layoutInCell="1" allowOverlap="1" wp14:anchorId="4344C182" wp14:editId="7ECD0E36">
+              <wp:anchor distT="0" distB="0" distL="114300" distR="114300" simplePos="0" relativeHeight="251658246" behindDoc="0" locked="0" layoutInCell="1" allowOverlap="1" wp14:anchorId="4344C182" wp14:editId="7ECD0E36">
                 <wp:simplePos x="0" y="0"/>
                 <wp:positionH relativeFrom="column">
                   <wp:posOffset>3524250</wp:posOffset>
@@ -874,9 +874,9 @@
               </wp:anchor>
             </w:drawing>
           </mc:Choice>
-          <mc:Fallback>
-            <w:pict>
-              <v:rect w14:anchorId="563076BE" id="Rectángulo 9" o:spid="_x0000_s1026" style="position:absolute;margin-left:277.5pt;margin-top:4.45pt;width:22.5pt;height:14.25pt;z-index:251671552;visibility:visible;mso-wrap-style:square;mso-wrap-distance-left:9pt;mso-wrap-distance-top:0;mso-wrap-distance-right:9pt;mso-wrap-distance-bottom:0;mso-position-horizontal:absolute;mso-position-horizontal-relative:text;mso-position-vertical:absolute;mso-position-vertical-relative:text;v-text-anchor:middle" o:gfxdata="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" filled="f" strokecolor="#1f4d78 [1604]" strokeweight="1pt"/>
+          <mc:Fallback xmlns:a14="http://schemas.microsoft.com/office/drawing/2010/main" xmlns:a="http://schemas.openxmlformats.org/drawingml/2006/main" xmlns:pic="http://schemas.openxmlformats.org/drawingml/2006/picture" xmlns:arto="http://schemas.microsoft.com/office/word/2006/arto">
+            <w:pict w14:anchorId="109C72EB">
+              <v:rect id="Rectángulo 9" style="position:absolute;margin-left:277.5pt;margin-top:4.45pt;width:22.5pt;height:14.25pt;z-index:251671552;visibility:visible;mso-wrap-style:square;mso-wrap-distance-left:9pt;mso-wrap-distance-top:0;mso-wrap-distance-right:9pt;mso-wrap-distance-bottom:0;mso-position-horizontal:absolute;mso-position-horizontal-relative:text;mso-position-vertical:absolute;mso-position-vertical-relative:text;v-text-anchor:middle" o:spid="_x0000_s1026" filled="f" strokecolor="#1f4d78 [1604]" strokeweight="1pt" w14:anchorId="563076BE" o:gfxdata="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"/>
             </w:pict>
           </mc:Fallback>
         </mc:AlternateContent>
@@ -890,7 +890,7 @@
         <mc:AlternateContent>
           <mc:Choice Requires="wps">
             <w:drawing>
-              <wp:anchor distT="0" distB="0" distL="114300" distR="114300" simplePos="0" relativeHeight="251673600" behindDoc="0" locked="0" layoutInCell="1" allowOverlap="1" wp14:anchorId="25FCAE83" wp14:editId="29E88BD3">
+              <wp:anchor distT="0" distB="0" distL="114300" distR="114300" simplePos="0" relativeHeight="251658247" behindDoc="0" locked="0" layoutInCell="1" allowOverlap="1" wp14:anchorId="25FCAE83" wp14:editId="29E88BD3">
                 <wp:simplePos x="0" y="0"/>
                 <wp:positionH relativeFrom="column">
                   <wp:posOffset>4962525</wp:posOffset>
@@ -951,9 +951,9 @@
               </wp:anchor>
             </w:drawing>
           </mc:Choice>
-          <mc:Fallback>
-            <w:pict>
-              <v:rect w14:anchorId="2BE4AE17" id="Rectángulo 10" o:spid="_x0000_s1026" style="position:absolute;margin-left:390.75pt;margin-top:2.95pt;width:22.5pt;height:14.25pt;z-index:251673600;visibility:visible;mso-wrap-style:square;mso-width-percent:0;mso-height-percent:0;mso-wrap-distance-left:9pt;mso-wrap-distance-top:0;mso-wrap-distance-right:9pt;mso-wrap-distance-bottom:0;mso-position-horizontal:absolute;mso-position-horizontal-relative:text;mso-position-vertical:absolute;mso-position-vertical-relative:text;mso-width-percent:0;mso-height-percent:0;mso-width-relative:margin;mso-height-relative:margin;v-text-anchor:middle" o:gfxdata="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" filled="f" strokecolor="#1f4d78 [1604]" strokeweight="1pt"/>
+          <mc:Fallback xmlns:a14="http://schemas.microsoft.com/office/drawing/2010/main" xmlns:a="http://schemas.openxmlformats.org/drawingml/2006/main" xmlns:pic="http://schemas.openxmlformats.org/drawingml/2006/picture" xmlns:arto="http://schemas.microsoft.com/office/word/2006/arto">
+            <w:pict w14:anchorId="7A86DE9F">
+              <v:rect id="Rectángulo 10" style="position:absolute;margin-left:390.75pt;margin-top:2.95pt;width:22.5pt;height:14.25pt;z-index:251673600;visibility:visible;mso-wrap-style:square;mso-width-percent:0;mso-height-percent:0;mso-wrap-distance-left:9pt;mso-wrap-distance-top:0;mso-wrap-distance-right:9pt;mso-wrap-distance-bottom:0;mso-position-horizontal:absolute;mso-position-horizontal-relative:text;mso-position-vertical:absolute;mso-position-vertical-relative:text;mso-width-percent:0;mso-height-percent:0;mso-width-relative:margin;mso-height-relative:margin;v-text-anchor:middle" o:spid="_x0000_s1026" filled="f" strokecolor="#1f4d78 [1604]" strokeweight="1pt" w14:anchorId="2BE4AE17" o:gfxdata="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"/>
             </w:pict>
           </mc:Fallback>
         </mc:AlternateContent>
@@ -967,7 +967,7 @@
         <mc:AlternateContent>
           <mc:Choice Requires="wps">
             <w:drawing>
-              <wp:anchor distT="0" distB="0" distL="114300" distR="114300" simplePos="0" relativeHeight="251669504" behindDoc="0" locked="0" layoutInCell="1" allowOverlap="1" wp14:anchorId="1C901C4D" wp14:editId="62DCAF77">
+              <wp:anchor distT="0" distB="0" distL="114300" distR="114300" simplePos="0" relativeHeight="251658245" behindDoc="0" locked="0" layoutInCell="1" allowOverlap="1" wp14:anchorId="1C901C4D" wp14:editId="62DCAF77">
                 <wp:simplePos x="0" y="0"/>
                 <wp:positionH relativeFrom="column">
                   <wp:posOffset>2025015</wp:posOffset>
@@ -1028,9 +1028,9 @@
               </wp:anchor>
             </w:drawing>
           </mc:Choice>
-          <mc:Fallback>
-            <w:pict>
-              <v:rect w14:anchorId="0A49F1DE" id="Rectángulo 8" o:spid="_x0000_s1026" style="position:absolute;margin-left:159.45pt;margin-top:6.3pt;width:22.5pt;height:14.25pt;z-index:251669504;visibility:visible;mso-wrap-style:square;mso-width-percent:0;mso-height-percent:0;mso-wrap-distance-left:9pt;mso-wrap-distance-top:0;mso-wrap-distance-right:9pt;mso-wrap-distance-bottom:0;mso-position-horizontal:absolute;mso-position-horizontal-relative:text;mso-position-vertical:absolute;mso-position-vertical-relative:text;mso-width-percent:0;mso-height-percent:0;mso-width-relative:margin;mso-height-relative:margin;v-text-anchor:middle" o:gfxdata="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" filled="f" strokecolor="#1f4d78 [1604]" strokeweight="1pt"/>
+          <mc:Fallback xmlns:a14="http://schemas.microsoft.com/office/drawing/2010/main" xmlns:a="http://schemas.openxmlformats.org/drawingml/2006/main" xmlns:pic="http://schemas.openxmlformats.org/drawingml/2006/picture" xmlns:arto="http://schemas.microsoft.com/office/word/2006/arto">
+            <w:pict w14:anchorId="5D75FB4E">
+              <v:rect id="Rectángulo 8" style="position:absolute;margin-left:159.45pt;margin-top:6.3pt;width:22.5pt;height:14.25pt;z-index:251669504;visibility:visible;mso-wrap-style:square;mso-width-percent:0;mso-height-percent:0;mso-wrap-distance-left:9pt;mso-wrap-distance-top:0;mso-wrap-distance-right:9pt;mso-wrap-distance-bottom:0;mso-position-horizontal:absolute;mso-position-horizontal-relative:text;mso-position-vertical:absolute;mso-position-vertical-relative:text;mso-width-percent:0;mso-height-percent:0;mso-width-relative:margin;mso-height-relative:margin;v-text-anchor:middle" o:spid="_x0000_s1026" filled="f" strokecolor="#1f4d78 [1604]" strokeweight="1pt" w14:anchorId="0A49F1DE" o:gfxdata="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"/>
             </w:pict>
           </mc:Fallback>
         </mc:AlternateContent>
@@ -1044,7 +1044,7 @@
         <mc:AlternateContent>
           <mc:Choice Requires="wps">
             <w:drawing>
-              <wp:anchor distT="0" distB="0" distL="114300" distR="114300" simplePos="0" relativeHeight="251667456" behindDoc="0" locked="0" layoutInCell="1" allowOverlap="1" wp14:anchorId="77E47334" wp14:editId="49CD4D18">
+              <wp:anchor distT="0" distB="0" distL="114300" distR="114300" simplePos="0" relativeHeight="251658244" behindDoc="0" locked="0" layoutInCell="1" allowOverlap="1" wp14:anchorId="77E47334" wp14:editId="49CD4D18">
                 <wp:simplePos x="0" y="0"/>
                 <wp:positionH relativeFrom="column">
                   <wp:posOffset>805815</wp:posOffset>
@@ -1099,9 +1099,9 @@
               </wp:anchor>
             </w:drawing>
           </mc:Choice>
-          <mc:Fallback>
-            <w:pict>
-              <v:rect w14:anchorId="329444A8" id="Rectángulo 7" o:spid="_x0000_s1026" style="position:absolute;margin-left:63.45pt;margin-top:4.8pt;width:22.5pt;height:14.25pt;z-index:251667456;visibility:visible;mso-wrap-style:square;mso-wrap-distance-left:9pt;mso-wrap-distance-top:0;mso-wrap-distance-right:9pt;mso-wrap-distance-bottom:0;mso-position-horizontal:absolute;mso-position-horizontal-relative:text;mso-position-vertical:absolute;mso-position-vertical-relative:text;v-text-anchor:middle" o:gfxdata="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" filled="f" strokecolor="#1f4d78 [1604]" strokeweight="1pt"/>
+          <mc:Fallback xmlns:a14="http://schemas.microsoft.com/office/drawing/2010/main" xmlns:a="http://schemas.openxmlformats.org/drawingml/2006/main" xmlns:pic="http://schemas.openxmlformats.org/drawingml/2006/picture" xmlns:arto="http://schemas.microsoft.com/office/word/2006/arto">
+            <w:pict w14:anchorId="74B4F484">
+              <v:rect id="Rectángulo 7" style="position:absolute;margin-left:63.45pt;margin-top:4.8pt;width:22.5pt;height:14.25pt;z-index:251667456;visibility:visible;mso-wrap-style:square;mso-wrap-distance-left:9pt;mso-wrap-distance-top:0;mso-wrap-distance-right:9pt;mso-wrap-distance-bottom:0;mso-position-horizontal:absolute;mso-position-horizontal-relative:text;mso-position-vertical:absolute;mso-position-vertical-relative:text;v-text-anchor:middle" o:spid="_x0000_s1026" filled="f" strokecolor="#1f4d78 [1604]" strokeweight="1pt" w14:anchorId="329444A8" o:gfxdata="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"/>
             </w:pict>
           </mc:Fallback>
         </mc:AlternateContent>
@@ -1251,7 +1251,7 @@
     </w:p>
     <w:tbl>
       <w:tblPr>
-        <w:tblStyle w:val="Tablaconcuadrcula"/>
+        <w:tblStyle w:val="TableGrid"/>
         <w:tblW w:w="0" w:type="auto"/>
         <w:tblLook w:val="04A0" w:firstRow="1" w:lastRow="0" w:firstColumn="1" w:lastColumn="0" w:noHBand="0" w:noVBand="1"/>
       </w:tblPr>
@@ -2415,7 +2415,7 @@
     </w:p>
     <w:tbl>
       <w:tblPr>
-        <w:tblStyle w:val="Tablaconcuadrcula"/>
+        <w:tblStyle w:val="TableGrid"/>
         <w:tblW w:w="0" w:type="auto"/>
         <w:jc w:val="center"/>
         <w:tblLook w:val="04A0" w:firstRow="1" w:lastRow="0" w:firstColumn="1" w:lastColumn="0" w:noHBand="0" w:noVBand="1"/>
@@ -2519,7 +2519,7 @@
     </w:tbl>
     <w:p>
       <w:pPr>
-        <w:pStyle w:val="Prrafodelista"/>
+        <w:pStyle w:val="ListParagraph"/>
         <w:jc w:val="center"/>
         <w:rPr>
           <w:rFonts w:ascii="Arial" w:hAnsi="Arial" w:cs="Arial"/>
@@ -2624,7 +2624,7 @@
     </w:p>
     <w:p>
       <w:pPr>
-        <w:pStyle w:val="Prrafodelista"/>
+        <w:pStyle w:val="ListParagraph"/>
         <w:numPr>
           <w:ilvl w:val="0"/>
           <w:numId w:val="1"/>
@@ -2671,7 +2671,7 @@
     </w:p>
     <w:p>
       <w:pPr>
-        <w:pStyle w:val="Prrafodelista"/>
+        <w:pStyle w:val="ListParagraph"/>
         <w:numPr>
           <w:ilvl w:val="0"/>
           <w:numId w:val="1"/>
@@ -2710,7 +2710,7 @@
     </w:p>
     <w:p>
       <w:pPr>
-        <w:pStyle w:val="Prrafodelista"/>
+        <w:pStyle w:val="ListParagraph"/>
         <w:numPr>
           <w:ilvl w:val="0"/>
           <w:numId w:val="1"/>
@@ -2765,7 +2765,7 @@
     </w:p>
     <w:p>
       <w:pPr>
-        <w:pStyle w:val="Prrafodelista"/>
+        <w:pStyle w:val="ListParagraph"/>
         <w:numPr>
           <w:ilvl w:val="0"/>
           <w:numId w:val="1"/>
@@ -2804,7 +2804,7 @@
     </w:p>
     <w:p>
       <w:pPr>
-        <w:pStyle w:val="Prrafodelista"/>
+        <w:pStyle w:val="ListParagraph"/>
         <w:numPr>
           <w:ilvl w:val="0"/>
           <w:numId w:val="1"/>
@@ -2835,7 +2835,7 @@
     </w:p>
     <w:p>
       <w:pPr>
-        <w:pStyle w:val="Prrafodelista"/>
+        <w:pStyle w:val="ListParagraph"/>
         <w:numPr>
           <w:ilvl w:val="0"/>
           <w:numId w:val="1"/>
@@ -2874,7 +2874,7 @@
     </w:p>
     <w:p>
       <w:pPr>
-        <w:pStyle w:val="Prrafodelista"/>
+        <w:pStyle w:val="ListParagraph"/>
         <w:numPr>
           <w:ilvl w:val="0"/>
           <w:numId w:val="1"/>
@@ -2953,7 +2953,7 @@
     </w:p>
     <w:p>
       <w:pPr>
-        <w:pStyle w:val="Prrafodelista"/>
+        <w:pStyle w:val="ListParagraph"/>
         <w:numPr>
           <w:ilvl w:val="0"/>
           <w:numId w:val="1"/>
@@ -3021,7 +3021,7 @@
     </w:p>
     <w:tbl>
       <w:tblPr>
-        <w:tblStyle w:val="Tablaconcuadrcula"/>
+        <w:tblStyle w:val="TableGrid"/>
         <w:tblW w:w="0" w:type="auto"/>
         <w:tblBorders>
           <w:top w:val="none" w:sz="0" w:space="0" w:color="auto"/>
@@ -3188,15 +3188,16 @@
     </w:p>
     <w:tbl>
       <w:tblPr>
-        <w:tblStyle w:val="Tablaconcuadrcula"/>
+        <w:tblStyle w:val="TableGrid"/>
         <w:tblW w:w="9209" w:type="dxa"/>
         <w:tblLook w:val="04A0" w:firstRow="1" w:lastRow="0" w:firstColumn="1" w:lastColumn="0" w:noHBand="0" w:noVBand="1"/>
       </w:tblPr>
       <w:tblGrid>
         <w:gridCol w:w="550"/>
+        <w:gridCol w:w="1839"/>
+        <w:gridCol w:w="1565"/>
+        <w:gridCol w:w="1841"/>
         <w:gridCol w:w="3414"/>
-        <w:gridCol w:w="1843"/>
-        <w:gridCol w:w="3402"/>
       </w:tblGrid>
       <w:tr>
         <w:trPr>
@@ -3226,6 +3227,7 @@
         <w:tc>
           <w:tcPr>
             <w:tcW w:w="3414" w:type="dxa"/>
+            <w:gridSpan w:val="2"/>
           </w:tcPr>
           <w:p>
             <w:pPr>
@@ -3317,15 +3319,24 @@
         <w:tc>
           <w:tcPr>
             <w:tcW w:w="3414" w:type="dxa"/>
-          </w:tcPr>
-          <w:p>
-            <w:pPr>
-              <w:rPr>
-                <w:rFonts w:ascii="Arial" w:hAnsi="Arial" w:cs="Arial"/>
-                <w:sz w:val="18"/>
-                <w:szCs w:val="18"/>
-              </w:rPr>
-            </w:pPr>
+            <w:gridSpan w:val="2"/>
+          </w:tcPr>
+          <w:p>
+            <w:pPr>
+              <w:rPr>
+                <w:rFonts w:ascii="Arial" w:hAnsi="Arial" w:cs="Arial"/>
+                <w:sz w:val="18"/>
+                <w:szCs w:val="18"/>
+              </w:rPr>
+            </w:pPr>
+            <w:r>
+              <w:rPr>
+                <w:rFonts w:ascii="Arial" w:hAnsi="Arial" w:cs="Arial"/>
+                <w:sz w:val="18"/>
+                <w:szCs w:val="18"/>
+              </w:rPr>
+              <w:t>Andrés Felipe González Otálora</w:t>
+            </w:r>
           </w:p>
         </w:tc>
         <w:tc>
@@ -3340,6 +3351,14 @@
                 <w:szCs w:val="18"/>
               </w:rPr>
             </w:pPr>
+            <w:r>
+              <w:rPr>
+                <w:rFonts w:ascii="Arial" w:hAnsi="Arial" w:cs="Arial"/>
+                <w:sz w:val="18"/>
+                <w:szCs w:val="18"/>
+              </w:rPr>
+              <w:t>1007408127</w:t>
+            </w:r>
           </w:p>
         </w:tc>
         <w:tc>
@@ -3347,13 +3366,186 @@
             <w:tcW w:w="3402" w:type="dxa"/>
           </w:tcPr>
           <w:p>
-            <w:pPr>
-              <w:rPr>
-                <w:rFonts w:ascii="Arial" w:hAnsi="Arial" w:cs="Arial"/>
-                <w:sz w:val="18"/>
-                <w:szCs w:val="18"/>
-              </w:rPr>
-            </w:pPr>
+            <w:r>
+              <w:rPr>
+                <w:noProof/>
+              </w:rPr>
+              <w:drawing>
+                <wp:inline distT="0" distB="0" distL="0" distR="0" wp14:anchorId="12F0C4B9" wp14:editId="46AC4953">
+                  <wp:extent cx="1987448" cy="457200"/>
+                  <wp:effectExtent l="0" t="0" r="0" b="0"/>
+                  <wp:docPr id="1590458203" name="drawing"/>
+                  <wp:cNvGraphicFramePr>
+                    <a:graphicFrameLocks xmlns:a="http://schemas.openxmlformats.org/drawingml/2006/main" noChangeAspect="1"/>
+                  </wp:cNvGraphicFramePr>
+                  <a:graphic xmlns:a="http://schemas.openxmlformats.org/drawingml/2006/main">
+                    <a:graphicData uri="http://schemas.openxmlformats.org/drawingml/2006/picture">
+                      <pic:pic xmlns:pic="http://schemas.openxmlformats.org/drawingml/2006/picture">
+                        <pic:nvPicPr>
+                          <pic:cNvPr id="1590458203" name="Picture 1590458203"/>
+                          <pic:cNvPicPr/>
+                        </pic:nvPicPr>
+                        <pic:blipFill>
+                          <a:blip r:embed="rId8">
+                            <a:extLst>
+                              <a:ext uri="{28A0092B-C50C-407E-A947-70E740481C1C}">
+                                <a14:useLocalDpi xmlns:a14="http://schemas.microsoft.com/office/drawing/2010/main"/>
+                              </a:ext>
+                            </a:extLst>
+                          </a:blip>
+                          <a:stretch>
+                            <a:fillRect/>
+                          </a:stretch>
+                        </pic:blipFill>
+                        <pic:spPr>
+                          <a:xfrm>
+                            <a:off x="0" y="0"/>
+                            <a:ext cx="1987448" cy="457200"/>
+                          </a:xfrm>
+                          <a:prstGeom prst="rect">
+                            <a:avLst/>
+                          </a:prstGeom>
+                        </pic:spPr>
+                      </pic:pic>
+                    </a:graphicData>
+                  </a:graphic>
+                </wp:inline>
+              </w:drawing>
+            </w:r>
+          </w:p>
+        </w:tc>
+      </w:tr>
+      <w:tr>
+        <w:trPr>
+          <w:trHeight w:val="1230"/>
+        </w:trPr>
+        <w:tc>
+          <w:tcPr>
+            <w:tcW w:w="550" w:type="dxa"/>
+          </w:tcPr>
+          <w:p>
+            <w:pPr>
+              <w:jc w:val="center"/>
+              <w:rPr>
+                <w:rFonts w:ascii="Arial" w:hAnsi="Arial" w:cs="Arial"/>
+                <w:sz w:val="18"/>
+                <w:szCs w:val="18"/>
+              </w:rPr>
+            </w:pPr>
+            <w:r>
+              <w:rPr>
+                <w:rFonts w:ascii="Arial" w:hAnsi="Arial" w:cs="Arial"/>
+                <w:sz w:val="18"/>
+                <w:szCs w:val="18"/>
+              </w:rPr>
+              <w:t>2</w:t>
+            </w:r>
+          </w:p>
+        </w:tc>
+        <w:tc>
+          <w:tcPr>
+            <w:tcW w:w="3414" w:type="dxa"/>
+            <w:gridSpan w:val="2"/>
+          </w:tcPr>
+          <w:p>
+            <w:pPr>
+              <w:rPr>
+                <w:rFonts w:ascii="Arial" w:hAnsi="Arial" w:cs="Arial"/>
+                <w:sz w:val="18"/>
+                <w:szCs w:val="18"/>
+              </w:rPr>
+            </w:pPr>
+            <w:r>
+              <w:rPr>
+                <w:rFonts w:ascii="Arial" w:hAnsi="Arial" w:cs="Arial"/>
+                <w:sz w:val="18"/>
+                <w:szCs w:val="18"/>
+              </w:rPr>
+              <w:t>Astrid Daniela Peña Rodriguez</w:t>
+            </w:r>
+          </w:p>
+        </w:tc>
+        <w:tc>
+          <w:tcPr>
+            <w:tcW w:w="1843" w:type="dxa"/>
+          </w:tcPr>
+          <w:p>
+            <w:pPr>
+              <w:rPr>
+                <w:rFonts w:ascii="Arial" w:hAnsi="Arial" w:cs="Arial"/>
+                <w:sz w:val="18"/>
+                <w:szCs w:val="18"/>
+              </w:rPr>
+            </w:pPr>
+            <w:r>
+              <w:rPr>
+                <w:rFonts w:ascii="Arial" w:hAnsi="Arial" w:cs="Arial"/>
+                <w:sz w:val="18"/>
+                <w:szCs w:val="18"/>
+              </w:rPr>
+              <w:t>1007519549</w:t>
+            </w:r>
+          </w:p>
+        </w:tc>
+        <w:tc>
+          <w:tcPr>
+            <w:tcW w:w="3402" w:type="dxa"/>
+          </w:tcPr>
+          <w:p>
+            <w:pPr>
+              <w:rPr>
+                <w:rFonts w:ascii="Arial" w:hAnsi="Arial" w:cs="Arial"/>
+                <w:sz w:val="18"/>
+                <w:szCs w:val="18"/>
+              </w:rPr>
+            </w:pPr>
+            <w:r>
+              <w:rPr>
+                <w:noProof/>
+              </w:rPr>
+              <w:drawing>
+                <wp:inline distT="0" distB="0" distL="0" distR="0" wp14:anchorId="08C331D6" wp14:editId="6E1D758C">
+                  <wp:extent cx="706701" cy="476256"/>
+                  <wp:effectExtent l="0" t="0" r="0" b="0"/>
+                  <wp:docPr id="1984336213" name="drawing"/>
+                  <wp:cNvGraphicFramePr>
+                    <a:graphicFrameLocks xmlns:a="http://schemas.openxmlformats.org/drawingml/2006/main" noChangeAspect="1"/>
+                  </wp:cNvGraphicFramePr>
+                  <a:graphic xmlns:a="http://schemas.openxmlformats.org/drawingml/2006/main">
+                    <a:graphicData uri="http://schemas.openxmlformats.org/drawingml/2006/picture">
+                      <pic:pic xmlns:pic="http://schemas.openxmlformats.org/drawingml/2006/picture">
+                        <pic:nvPicPr>
+                          <pic:cNvPr id="1984336213" name="Picture 1984336213"/>
+                          <pic:cNvPicPr/>
+                        </pic:nvPicPr>
+                        <pic:blipFill>
+                          <a:blip r:embed="rId9">
+                            <a:extLst>
+                              <a:ext uri="{28A0092B-C50C-407E-A947-70E740481C1C}">
+                                <a14:useLocalDpi xmlns:a14="http://schemas.microsoft.com/office/drawing/2010/main"/>
+                              </a:ext>
+                            </a:extLst>
+                          </a:blip>
+                          <a:srcRect l="19339" t="17514" r="15566" b="29943"/>
+                          <a:stretch>
+                            <a:fillRect/>
+                          </a:stretch>
+                        </pic:blipFill>
+                        <pic:spPr>
+                          <a:xfrm>
+                            <a:off x="0" y="0"/>
+                            <a:ext cx="706701" cy="476256"/>
+                          </a:xfrm>
+                          <a:prstGeom prst="rect">
+                            <a:avLst/>
+                          </a:prstGeom>
+                        </pic:spPr>
+                      </pic:pic>
+                    </a:graphicData>
+                  </a:graphic>
+                </wp:inline>
+              </w:drawing>
+            </w:r>
           </w:p>
         </w:tc>
       </w:tr>
@@ -3380,22 +3572,39 @@
                 <w:sz w:val="18"/>
                 <w:szCs w:val="18"/>
               </w:rPr>
-              <w:t>2</w:t>
+              <w:t>3</w:t>
             </w:r>
           </w:p>
         </w:tc>
         <w:tc>
           <w:tcPr>
             <w:tcW w:w="3414" w:type="dxa"/>
-          </w:tcPr>
-          <w:p>
-            <w:pPr>
-              <w:rPr>
-                <w:rFonts w:ascii="Arial" w:hAnsi="Arial" w:cs="Arial"/>
-                <w:sz w:val="18"/>
-                <w:szCs w:val="18"/>
-              </w:rPr>
-            </w:pPr>
+            <w:gridSpan w:val="2"/>
+          </w:tcPr>
+          <w:p>
+            <w:pPr>
+              <w:rPr>
+                <w:rFonts w:ascii="Arial" w:hAnsi="Arial" w:cs="Arial"/>
+                <w:sz w:val="18"/>
+                <w:szCs w:val="18"/>
+              </w:rPr>
+            </w:pPr>
+            <w:r>
+              <w:rPr>
+                <w:rFonts w:ascii="Arial" w:hAnsi="Arial" w:cs="Arial"/>
+                <w:sz w:val="18"/>
+                <w:szCs w:val="18"/>
+              </w:rPr>
+              <w:t xml:space="preserve">Daniel Felipe Riaño </w:t>
+            </w:r>
+            <w:r>
+              <w:rPr>
+                <w:rFonts w:ascii="Arial" w:hAnsi="Arial" w:cs="Arial"/>
+                <w:sz w:val="18"/>
+                <w:szCs w:val="18"/>
+              </w:rPr>
+              <w:t>Moreno</w:t>
+            </w:r>
           </w:p>
         </w:tc>
         <w:tc>
@@ -3410,11 +3619,117 @@
                 <w:szCs w:val="18"/>
               </w:rPr>
             </w:pPr>
+            <w:r>
+              <w:rPr>
+                <w:rFonts w:ascii="Arial" w:hAnsi="Arial" w:cs="Arial"/>
+                <w:sz w:val="18"/>
+                <w:szCs w:val="18"/>
+              </w:rPr>
+              <w:t>1001065355</w:t>
+            </w:r>
           </w:p>
         </w:tc>
         <w:tc>
           <w:tcPr>
             <w:tcW w:w="3402" w:type="dxa"/>
+          </w:tcPr>
+          <w:p>
+            <w:r>
+              <w:rPr>
+                <w:noProof/>
+              </w:rPr>
+              <w:drawing>
+                <wp:inline distT="0" distB="0" distL="0" distR="0" wp14:anchorId="2A381610" wp14:editId="452BFFAF">
+                  <wp:extent cx="828791" cy="219106"/>
+                  <wp:effectExtent l="0" t="0" r="0" b="0"/>
+                  <wp:docPr id="1530096253" name="drawing"/>
+                  <wp:cNvGraphicFramePr>
+                    <a:graphicFrameLocks xmlns:a="http://schemas.openxmlformats.org/drawingml/2006/main" noChangeAspect="1"/>
+                  </wp:cNvGraphicFramePr>
+                  <a:graphic xmlns:a="http://schemas.openxmlformats.org/drawingml/2006/main">
+                    <a:graphicData uri="http://schemas.openxmlformats.org/drawingml/2006/picture">
+                      <pic:pic xmlns:pic="http://schemas.openxmlformats.org/drawingml/2006/picture">
+                        <pic:nvPicPr>
+                          <pic:cNvPr id="1530096253" name="Picture 1530096253"/>
+                          <pic:cNvPicPr/>
+                        </pic:nvPicPr>
+                        <pic:blipFill>
+                          <a:blip r:embed="rId10">
+                            <a:extLst>
+                              <a:ext uri="{28A0092B-C50C-407E-A947-70E740481C1C}">
+                                <a14:useLocalDpi xmlns:a14="http://schemas.microsoft.com/office/drawing/2010/main"/>
+                              </a:ext>
+                            </a:extLst>
+                          </a:blip>
+                          <a:stretch>
+                            <a:fillRect/>
+                          </a:stretch>
+                        </pic:blipFill>
+                        <pic:spPr>
+                          <a:xfrm>
+                            <a:off x="0" y="0"/>
+                            <a:ext cx="828791" cy="219106"/>
+                          </a:xfrm>
+                          <a:prstGeom prst="rect">
+                            <a:avLst/>
+                          </a:prstGeom>
+                        </pic:spPr>
+                      </pic:pic>
+                    </a:graphicData>
+                  </a:graphic>
+                </wp:inline>
+              </w:drawing>
+            </w:r>
+          </w:p>
+        </w:tc>
+      </w:tr>
+      <w:tr>
+        <w:trPr>
+          <w:gridAfter w:val="1"/>
+          <w:wAfter w:w="3414" w:type="dxa"/>
+          <w:trHeight w:val="284"/>
+        </w:trPr>
+        <w:tc>
+          <w:tcPr>
+            <w:tcW w:w="550" w:type="dxa"/>
+          </w:tcPr>
+          <w:p>
+            <w:pPr>
+              <w:jc w:val="center"/>
+              <w:rPr>
+                <w:rFonts w:ascii="Arial" w:hAnsi="Arial" w:cs="Arial"/>
+                <w:sz w:val="18"/>
+                <w:szCs w:val="18"/>
+              </w:rPr>
+            </w:pPr>
+            <w:r>
+              <w:rPr>
+                <w:rFonts w:ascii="Arial" w:hAnsi="Arial" w:cs="Arial"/>
+                <w:sz w:val="18"/>
+                <w:szCs w:val="18"/>
+              </w:rPr>
+              <w:t>4</w:t>
+            </w:r>
+          </w:p>
+        </w:tc>
+        <w:tc>
+          <w:tcPr>
+            <w:tcW w:w="1843" w:type="dxa"/>
+          </w:tcPr>
+          <w:p>
+            <w:pPr>
+              <w:rPr>
+                <w:rFonts w:ascii="Arial" w:hAnsi="Arial" w:cs="Arial"/>
+                <w:sz w:val="18"/>
+                <w:szCs w:val="18"/>
+              </w:rPr>
+            </w:pPr>
+          </w:p>
+        </w:tc>
+        <w:tc>
+          <w:tcPr>
+            <w:tcW w:w="3402" w:type="dxa"/>
+            <w:gridSpan w:val="2"/>
           </w:tcPr>
           <w:p>
             <w:pPr>
@@ -3450,22 +3765,31 @@
                 <w:sz w:val="18"/>
                 <w:szCs w:val="18"/>
               </w:rPr>
-              <w:t>3</w:t>
+              <w:t>5</w:t>
             </w:r>
           </w:p>
         </w:tc>
         <w:tc>
           <w:tcPr>
             <w:tcW w:w="3414" w:type="dxa"/>
-          </w:tcPr>
-          <w:p>
-            <w:pPr>
-              <w:rPr>
-                <w:rFonts w:ascii="Arial" w:hAnsi="Arial" w:cs="Arial"/>
-                <w:sz w:val="18"/>
-                <w:szCs w:val="18"/>
-              </w:rPr>
-            </w:pPr>
+            <w:gridSpan w:val="2"/>
+          </w:tcPr>
+          <w:p>
+            <w:pPr>
+              <w:rPr>
+                <w:rFonts w:ascii="Arial" w:hAnsi="Arial" w:cs="Arial"/>
+                <w:sz w:val="18"/>
+                <w:szCs w:val="18"/>
+              </w:rPr>
+            </w:pPr>
+            <w:r>
+              <w:rPr>
+                <w:rFonts w:ascii="Arial" w:hAnsi="Arial" w:cs="Arial"/>
+                <w:sz w:val="18"/>
+                <w:szCs w:val="18"/>
+              </w:rPr>
+              <w:t xml:space="preserve">Nicolás Marentes Cardenas </w:t>
+            </w:r>
           </w:p>
         </w:tc>
         <w:tc>
@@ -3480,6 +3804,14 @@
                 <w:szCs w:val="18"/>
               </w:rPr>
             </w:pPr>
+            <w:r>
+              <w:rPr>
+                <w:rFonts w:ascii="Arial" w:hAnsi="Arial" w:cs="Arial"/>
+                <w:sz w:val="18"/>
+                <w:szCs w:val="18"/>
+              </w:rPr>
+              <w:t>1000787010</w:t>
+            </w:r>
           </w:p>
         </w:tc>
         <w:tc>
@@ -3494,6 +3826,52 @@
                 <w:szCs w:val="18"/>
               </w:rPr>
             </w:pPr>
+            <w:r>
+              <w:rPr>
+                <w:noProof/>
+              </w:rPr>
+              <w:drawing>
+                <wp:inline distT="0" distB="0" distL="0" distR="0" wp14:anchorId="58A18B10" wp14:editId="638CEFDD">
+                  <wp:extent cx="1994459" cy="455312"/>
+                  <wp:effectExtent l="0" t="0" r="0" b="0"/>
+                  <wp:docPr id="1838545362" name="drawing"/>
+                  <wp:cNvGraphicFramePr>
+                    <a:graphicFrameLocks xmlns:a="http://schemas.openxmlformats.org/drawingml/2006/main" noChangeAspect="1"/>
+                  </wp:cNvGraphicFramePr>
+                  <a:graphic xmlns:a="http://schemas.openxmlformats.org/drawingml/2006/main">
+                    <a:graphicData uri="http://schemas.openxmlformats.org/drawingml/2006/picture">
+                      <pic:pic xmlns:pic="http://schemas.openxmlformats.org/drawingml/2006/picture">
+                        <pic:nvPicPr>
+                          <pic:cNvPr id="1838545362" name="Picture 1838545362"/>
+                          <pic:cNvPicPr/>
+                        </pic:nvPicPr>
+                        <pic:blipFill>
+                          <a:blip r:embed="rId11">
+                            <a:extLst>
+                              <a:ext uri="{28A0092B-C50C-407E-A947-70E740481C1C}">
+                                <a14:useLocalDpi xmlns:a14="http://schemas.microsoft.com/office/drawing/2010/main"/>
+                              </a:ext>
+                            </a:extLst>
+                          </a:blip>
+                          <a:stretch>
+                            <a:fillRect/>
+                          </a:stretch>
+                        </pic:blipFill>
+                        <pic:spPr>
+                          <a:xfrm>
+                            <a:off x="0" y="0"/>
+                            <a:ext cx="1994459" cy="455312"/>
+                          </a:xfrm>
+                          <a:prstGeom prst="rect">
+                            <a:avLst/>
+                          </a:prstGeom>
+                        </pic:spPr>
+                      </pic:pic>
+                    </a:graphicData>
+                  </a:graphic>
+                </wp:inline>
+              </w:drawing>
+            </w:r>
           </w:p>
         </w:tc>
       </w:tr>
@@ -3520,22 +3898,31 @@
                 <w:sz w:val="18"/>
                 <w:szCs w:val="18"/>
               </w:rPr>
-              <w:t>4</w:t>
+              <w:t>6</w:t>
             </w:r>
           </w:p>
         </w:tc>
         <w:tc>
           <w:tcPr>
             <w:tcW w:w="3414" w:type="dxa"/>
-          </w:tcPr>
-          <w:p>
-            <w:pPr>
-              <w:rPr>
-                <w:rFonts w:ascii="Arial" w:hAnsi="Arial" w:cs="Arial"/>
-                <w:sz w:val="18"/>
-                <w:szCs w:val="18"/>
-              </w:rPr>
-            </w:pPr>
+            <w:gridSpan w:val="2"/>
+          </w:tcPr>
+          <w:p>
+            <w:pPr>
+              <w:rPr>
+                <w:rFonts w:ascii="Arial" w:hAnsi="Arial" w:cs="Arial"/>
+                <w:sz w:val="18"/>
+                <w:szCs w:val="18"/>
+              </w:rPr>
+            </w:pPr>
+            <w:r>
+              <w:rPr>
+                <w:rFonts w:ascii="Arial" w:hAnsi="Arial" w:cs="Arial"/>
+                <w:sz w:val="18"/>
+                <w:szCs w:val="18"/>
+              </w:rPr>
+              <w:t xml:space="preserve">William Daniel Bolívar </w:t>
+            </w:r>
           </w:p>
         </w:tc>
         <w:tc>
@@ -3550,20 +3937,69 @@
                 <w:szCs w:val="18"/>
               </w:rPr>
             </w:pPr>
+            <w:r>
+              <w:rPr>
+                <w:rFonts w:ascii="Arial" w:hAnsi="Arial" w:cs="Arial"/>
+                <w:sz w:val="18"/>
+                <w:szCs w:val="18"/>
+              </w:rPr>
+              <w:t>1022445842</w:t>
+            </w:r>
           </w:p>
         </w:tc>
         <w:tc>
           <w:tcPr>
             <w:tcW w:w="3402" w:type="dxa"/>
           </w:tcPr>
-          <w:p>
-            <w:pPr>
-              <w:rPr>
-                <w:rFonts w:ascii="Arial" w:hAnsi="Arial" w:cs="Arial"/>
-                <w:sz w:val="18"/>
-                <w:szCs w:val="18"/>
-              </w:rPr>
-            </w:pPr>
+          <w:p/>
+          <w:p>
+            <w:r>
+              <w:rPr>
+                <w:noProof/>
+              </w:rPr>
+              <w:drawing>
+                <wp:inline distT="0" distB="0" distL="0" distR="0" wp14:anchorId="197FEA88" wp14:editId="6B6C2751">
+                  <wp:extent cx="813555" cy="419373"/>
+                  <wp:effectExtent l="0" t="0" r="0" b="0"/>
+                  <wp:docPr id="1668554465" name="drawing"/>
+                  <wp:cNvGraphicFramePr>
+                    <a:graphicFrameLocks xmlns:a="http://schemas.openxmlformats.org/drawingml/2006/main" noChangeAspect="1"/>
+                  </wp:cNvGraphicFramePr>
+                  <a:graphic xmlns:a="http://schemas.openxmlformats.org/drawingml/2006/main">
+                    <a:graphicData uri="http://schemas.openxmlformats.org/drawingml/2006/picture">
+                      <pic:pic xmlns:pic="http://schemas.openxmlformats.org/drawingml/2006/picture">
+                        <pic:nvPicPr>
+                          <pic:cNvPr id="1668554465" name="Picture 1668554465"/>
+                          <pic:cNvPicPr/>
+                        </pic:nvPicPr>
+                        <pic:blipFill>
+                          <a:blip r:embed="rId12">
+                            <a:extLst>
+                              <a:ext uri="{28A0092B-C50C-407E-A947-70E740481C1C}">
+                                <a14:useLocalDpi xmlns:a14="http://schemas.microsoft.com/office/drawing/2010/main"/>
+                              </a:ext>
+                            </a:extLst>
+                          </a:blip>
+                          <a:srcRect l="11917" t="38028"/>
+                          <a:stretch>
+                            <a:fillRect/>
+                          </a:stretch>
+                        </pic:blipFill>
+                        <pic:spPr>
+                          <a:xfrm>
+                            <a:off x="0" y="0"/>
+                            <a:ext cx="813555" cy="419373"/>
+                          </a:xfrm>
+                          <a:prstGeom prst="rect">
+                            <a:avLst/>
+                          </a:prstGeom>
+                        </pic:spPr>
+                      </pic:pic>
+                    </a:graphicData>
+                  </a:graphic>
+                </wp:inline>
+              </w:drawing>
+            </w:r>
           </w:p>
         </w:tc>
       </w:tr>
@@ -3590,22 +4026,31 @@
                 <w:sz w:val="18"/>
                 <w:szCs w:val="18"/>
               </w:rPr>
-              <w:t>5</w:t>
+              <w:t>7</w:t>
             </w:r>
           </w:p>
         </w:tc>
         <w:tc>
           <w:tcPr>
             <w:tcW w:w="3414" w:type="dxa"/>
-          </w:tcPr>
-          <w:p>
-            <w:pPr>
-              <w:rPr>
-                <w:rFonts w:ascii="Arial" w:hAnsi="Arial" w:cs="Arial"/>
-                <w:sz w:val="18"/>
-                <w:szCs w:val="18"/>
-              </w:rPr>
-            </w:pPr>
+            <w:gridSpan w:val="2"/>
+          </w:tcPr>
+          <w:p>
+            <w:pPr>
+              <w:rPr>
+                <w:rFonts w:ascii="Arial" w:hAnsi="Arial" w:cs="Arial"/>
+                <w:sz w:val="18"/>
+                <w:szCs w:val="18"/>
+              </w:rPr>
+            </w:pPr>
+            <w:r>
+              <w:rPr>
+                <w:rFonts w:ascii="Arial" w:hAnsi="Arial" w:cs="Arial"/>
+                <w:sz w:val="18"/>
+                <w:szCs w:val="18"/>
+              </w:rPr>
+              <w:t>Christian david isaza osorio</w:t>
+            </w:r>
           </w:p>
         </w:tc>
         <w:tc>
@@ -3620,6 +4065,14 @@
                 <w:szCs w:val="18"/>
               </w:rPr>
             </w:pPr>
+            <w:r>
+              <w:rPr>
+                <w:rFonts w:ascii="Arial" w:hAnsi="Arial" w:cs="Arial"/>
+                <w:sz w:val="18"/>
+                <w:szCs w:val="18"/>
+              </w:rPr>
+              <w:t>1152436340</w:t>
+            </w:r>
           </w:p>
         </w:tc>
         <w:tc>
@@ -3660,22 +4113,31 @@
                 <w:sz w:val="18"/>
                 <w:szCs w:val="18"/>
               </w:rPr>
-              <w:t>6</w:t>
+              <w:t>8</w:t>
             </w:r>
           </w:p>
         </w:tc>
         <w:tc>
           <w:tcPr>
             <w:tcW w:w="3414" w:type="dxa"/>
-          </w:tcPr>
-          <w:p>
-            <w:pPr>
-              <w:rPr>
-                <w:rFonts w:ascii="Arial" w:hAnsi="Arial" w:cs="Arial"/>
-                <w:sz w:val="18"/>
-                <w:szCs w:val="18"/>
-              </w:rPr>
-            </w:pPr>
+            <w:gridSpan w:val="2"/>
+          </w:tcPr>
+          <w:p>
+            <w:pPr>
+              <w:rPr>
+                <w:rFonts w:ascii="Arial" w:hAnsi="Arial" w:cs="Arial"/>
+                <w:sz w:val="18"/>
+                <w:szCs w:val="18"/>
+              </w:rPr>
+            </w:pPr>
+            <w:r>
+              <w:rPr>
+                <w:rFonts w:ascii="Arial" w:hAnsi="Arial" w:cs="Arial"/>
+                <w:sz w:val="18"/>
+                <w:szCs w:val="18"/>
+              </w:rPr>
+              <w:t>Diego Andrés Fernández Peña</w:t>
+            </w:r>
           </w:p>
         </w:tc>
         <w:tc>
@@ -3690,6 +4152,14 @@
                 <w:szCs w:val="18"/>
               </w:rPr>
             </w:pPr>
+            <w:r>
+              <w:rPr>
+                <w:rFonts w:ascii="Arial" w:hAnsi="Arial" w:cs="Arial"/>
+                <w:sz w:val="18"/>
+                <w:szCs w:val="18"/>
+              </w:rPr>
+              <w:t>1016031379</w:t>
+            </w:r>
           </w:p>
         </w:tc>
         <w:tc>
@@ -3704,6 +4174,53 @@
                 <w:szCs w:val="18"/>
               </w:rPr>
             </w:pPr>
+            <w:r>
+              <w:rPr>
+                <w:noProof/>
+              </w:rPr>
+              <w:drawing>
+                <wp:inline distT="0" distB="0" distL="0" distR="0" wp14:anchorId="40CD2B4D" wp14:editId="4DE73F32">
+                  <wp:extent cx="439335" cy="527305"/>
+                  <wp:effectExtent l="0" t="0" r="0" b="0"/>
+                  <wp:docPr id="1206908151" name="drawing"/>
+                  <wp:cNvGraphicFramePr>
+                    <a:graphicFrameLocks xmlns:a="http://schemas.openxmlformats.org/drawingml/2006/main" noChangeAspect="1"/>
+                  </wp:cNvGraphicFramePr>
+                  <a:graphic xmlns:a="http://schemas.openxmlformats.org/drawingml/2006/main">
+                    <a:graphicData uri="http://schemas.openxmlformats.org/drawingml/2006/picture">
+                      <pic:pic xmlns:pic="http://schemas.openxmlformats.org/drawingml/2006/picture">
+                        <pic:nvPicPr>
+                          <pic:cNvPr id="1994695000" name="Picture 1994695000"/>
+                          <pic:cNvPicPr/>
+                        </pic:nvPicPr>
+                        <pic:blipFill>
+                          <a:blip r:embed="rId13">
+                            <a:extLst>
+                              <a:ext uri="{28A0092B-C50C-407E-A947-70E740481C1C}">
+                                <a14:useLocalDpi xmlns:a14="http://schemas.microsoft.com/office/drawing/2010/main"/>
+                              </a:ext>
+                            </a:extLst>
+                          </a:blip>
+                          <a:srcRect l="21428" t="29787" r="37500" b="31205"/>
+                          <a:stretch>
+                            <a:fillRect/>
+                          </a:stretch>
+                        </pic:blipFill>
+                        <pic:spPr>
+                          <a:xfrm>
+                            <a:off x="0" y="0"/>
+                            <a:ext cx="439335" cy="527305"/>
+                          </a:xfrm>
+                          <a:prstGeom prst="rect">
+                            <a:avLst/>
+                          </a:prstGeom>
+                        </pic:spPr>
+                      </pic:pic>
+                    </a:graphicData>
+                  </a:graphic>
+                </wp:inline>
+              </w:drawing>
+            </w:r>
           </w:p>
         </w:tc>
       </w:tr>
@@ -3730,13 +4247,14 @@
                 <w:sz w:val="18"/>
                 <w:szCs w:val="18"/>
               </w:rPr>
-              <w:t>7</w:t>
+              <w:t>9</w:t>
             </w:r>
           </w:p>
         </w:tc>
         <w:tc>
           <w:tcPr>
             <w:tcW w:w="3414" w:type="dxa"/>
+            <w:gridSpan w:val="2"/>
           </w:tcPr>
           <w:p>
             <w:pPr>
@@ -3800,22 +4318,31 @@
                 <w:sz w:val="18"/>
                 <w:szCs w:val="18"/>
               </w:rPr>
-              <w:t>8</w:t>
+              <w:t>10</w:t>
             </w:r>
           </w:p>
         </w:tc>
         <w:tc>
           <w:tcPr>
             <w:tcW w:w="3414" w:type="dxa"/>
-          </w:tcPr>
-          <w:p>
-            <w:pPr>
-              <w:rPr>
-                <w:rFonts w:ascii="Arial" w:hAnsi="Arial" w:cs="Arial"/>
-                <w:sz w:val="18"/>
-                <w:szCs w:val="18"/>
-              </w:rPr>
-            </w:pPr>
+            <w:gridSpan w:val="2"/>
+          </w:tcPr>
+          <w:p>
+            <w:pPr>
+              <w:rPr>
+                <w:rFonts w:ascii="Arial" w:hAnsi="Arial" w:cs="Arial"/>
+                <w:sz w:val="18"/>
+                <w:szCs w:val="18"/>
+              </w:rPr>
+            </w:pPr>
+            <w:r>
+              <w:rPr>
+                <w:rFonts w:ascii="Arial" w:hAnsi="Arial" w:cs="Arial"/>
+                <w:sz w:val="18"/>
+                <w:szCs w:val="18"/>
+              </w:rPr>
+              <w:t>José Alejandro Suarique Leguizamón</w:t>
+            </w:r>
           </w:p>
         </w:tc>
         <w:tc>
@@ -3830,6 +4357,14 @@
                 <w:szCs w:val="18"/>
               </w:rPr>
             </w:pPr>
+            <w:r>
+              <w:rPr>
+                <w:rFonts w:ascii="Arial" w:hAnsi="Arial" w:cs="Arial"/>
+                <w:sz w:val="18"/>
+                <w:szCs w:val="18"/>
+              </w:rPr>
+              <w:t>1001216728</w:t>
+            </w:r>
           </w:p>
         </w:tc>
         <w:tc>
@@ -3837,13 +4372,52 @@
             <w:tcW w:w="3402" w:type="dxa"/>
           </w:tcPr>
           <w:p>
-            <w:pPr>
-              <w:rPr>
-                <w:rFonts w:ascii="Arial" w:hAnsi="Arial" w:cs="Arial"/>
-                <w:sz w:val="18"/>
-                <w:szCs w:val="18"/>
-              </w:rPr>
-            </w:pPr>
+            <w:r>
+              <w:rPr>
+                <w:noProof/>
+              </w:rPr>
+              <w:drawing>
+                <wp:inline distT="0" distB="0" distL="0" distR="0" wp14:anchorId="00216639" wp14:editId="2FE3FF74">
+                  <wp:extent cx="571500" cy="2019300"/>
+                  <wp:effectExtent l="4833" t="17577" r="4833" b="17577"/>
+                  <wp:docPr id="231606207" name="drawing"/>
+                  <wp:cNvGraphicFramePr>
+                    <a:graphicFrameLocks xmlns:a="http://schemas.openxmlformats.org/drawingml/2006/main" noChangeAspect="1"/>
+                  </wp:cNvGraphicFramePr>
+                  <a:graphic xmlns:a="http://schemas.openxmlformats.org/drawingml/2006/main">
+                    <a:graphicData uri="http://schemas.openxmlformats.org/drawingml/2006/picture">
+                      <pic:pic xmlns:pic="http://schemas.openxmlformats.org/drawingml/2006/picture">
+                        <pic:nvPicPr>
+                          <pic:cNvPr id="231606207" name="Picture 231606207"/>
+                          <pic:cNvPicPr/>
+                        </pic:nvPicPr>
+                        <pic:blipFill>
+                          <a:blip r:embed="rId14">
+                            <a:extLst>
+                              <a:ext uri="{28A0092B-C50C-407E-A947-70E740481C1C}">
+                                <a14:useLocalDpi xmlns:a14="http://schemas.microsoft.com/office/drawing/2010/main"/>
+                              </a:ext>
+                            </a:extLst>
+                          </a:blip>
+                          <a:stretch>
+                            <a:fillRect/>
+                          </a:stretch>
+                        </pic:blipFill>
+                        <pic:spPr>
+                          <a:xfrm rot="16260000">
+                            <a:off x="0" y="0"/>
+                            <a:ext cx="571500" cy="2019300"/>
+                          </a:xfrm>
+                          <a:prstGeom prst="rect">
+                            <a:avLst/>
+                          </a:prstGeom>
+                        </pic:spPr>
+                      </pic:pic>
+                    </a:graphicData>
+                  </a:graphic>
+                </wp:inline>
+              </w:drawing>
+            </w:r>
           </w:p>
         </w:tc>
       </w:tr>
@@ -3870,22 +4444,31 @@
                 <w:sz w:val="18"/>
                 <w:szCs w:val="18"/>
               </w:rPr>
-              <w:t>9</w:t>
+              <w:t>11</w:t>
             </w:r>
           </w:p>
         </w:tc>
         <w:tc>
           <w:tcPr>
             <w:tcW w:w="3414" w:type="dxa"/>
-          </w:tcPr>
-          <w:p>
-            <w:pPr>
-              <w:rPr>
-                <w:rFonts w:ascii="Arial" w:hAnsi="Arial" w:cs="Arial"/>
-                <w:sz w:val="18"/>
-                <w:szCs w:val="18"/>
-              </w:rPr>
-            </w:pPr>
+            <w:gridSpan w:val="2"/>
+          </w:tcPr>
+          <w:p>
+            <w:pPr>
+              <w:rPr>
+                <w:rFonts w:ascii="Arial" w:hAnsi="Arial" w:cs="Arial"/>
+                <w:sz w:val="18"/>
+                <w:szCs w:val="18"/>
+              </w:rPr>
+            </w:pPr>
+            <w:r>
+              <w:rPr>
+                <w:rFonts w:ascii="Arial" w:hAnsi="Arial" w:cs="Arial"/>
+                <w:sz w:val="18"/>
+                <w:szCs w:val="18"/>
+              </w:rPr>
+              <w:t>Nilson David González Parra</w:t>
+            </w:r>
           </w:p>
         </w:tc>
         <w:tc>
@@ -3900,6 +4483,14 @@
                 <w:szCs w:val="18"/>
               </w:rPr>
             </w:pPr>
+            <w:r>
+              <w:rPr>
+                <w:rFonts w:ascii="Arial" w:hAnsi="Arial" w:cs="Arial"/>
+                <w:sz w:val="18"/>
+                <w:szCs w:val="18"/>
+              </w:rPr>
+              <w:t>1030699722</w:t>
+            </w:r>
           </w:p>
         </w:tc>
         <w:tc>
@@ -3914,6 +4505,72 @@
                 <w:szCs w:val="18"/>
               </w:rPr>
             </w:pPr>
+            <w:r>
+              <w:rPr>
+                <w:rFonts w:ascii="Arial" w:hAnsi="Arial" w:cs="Arial"/>
+                <w:noProof/>
+                <w:sz w:val="18"/>
+                <w:szCs w:val="18"/>
+              </w:rPr>
+              <w:drawing>
+                <wp:anchor distT="0" distB="0" distL="114300" distR="114300" simplePos="0" relativeHeight="251658249" behindDoc="0" locked="0" layoutInCell="1" allowOverlap="1" wp14:anchorId="479A7C85" wp14:editId="0B4FE276">
+                  <wp:simplePos x="0" y="0"/>
+                  <wp:positionH relativeFrom="column">
+                    <wp:posOffset>163830</wp:posOffset>
+                  </wp:positionH>
+                  <wp:positionV relativeFrom="paragraph">
+                    <wp:posOffset>29845</wp:posOffset>
+                  </wp:positionV>
+                  <wp:extent cx="1163320" cy="346075"/>
+                  <wp:effectExtent l="0" t="0" r="5080" b="0"/>
+                  <wp:wrapTopAndBottom/>
+                  <wp:docPr id="736058316" name="Imagen 1"/>
+                  <wp:cNvGraphicFramePr>
+                    <a:graphicFrameLocks xmlns:a="http://schemas.openxmlformats.org/drawingml/2006/main" noChangeAspect="1"/>
+                  </wp:cNvGraphicFramePr>
+                  <a:graphic xmlns:a="http://schemas.openxmlformats.org/drawingml/2006/main">
+                    <a:graphicData uri="http://schemas.openxmlformats.org/drawingml/2006/picture">
+                      <pic:pic xmlns:pic="http://schemas.openxmlformats.org/drawingml/2006/picture">
+                        <pic:nvPicPr>
+                          <pic:cNvPr id="736058316" name="Imagen 736058316"/>
+                          <pic:cNvPicPr/>
+                        </pic:nvPicPr>
+                        <pic:blipFill rotWithShape="1">
+                          <a:blip r:embed="rId15"/>
+                          <a:srcRect t="6313" b="12879"/>
+                          <a:stretch>
+                            <a:fillRect/>
+                          </a:stretch>
+                        </pic:blipFill>
+                        <pic:spPr bwMode="auto">
+                          <a:xfrm>
+                            <a:off x="0" y="0"/>
+                            <a:ext cx="1163320" cy="346075"/>
+                          </a:xfrm>
+                          <a:prstGeom prst="rect">
+                            <a:avLst/>
+                          </a:prstGeom>
+                          <a:ln>
+                            <a:noFill/>
+                          </a:ln>
+                          <a:extLst>
+                            <a:ext uri="{53640926-AAD7-44D8-BBD7-CCE9431645EC}">
+                              <a14:shadowObscured xmlns:a14="http://schemas.microsoft.com/office/drawing/2010/main"/>
+                            </a:ext>
+                          </a:extLst>
+                        </pic:spPr>
+                      </pic:pic>
+                    </a:graphicData>
+                  </a:graphic>
+                  <wp14:sizeRelH relativeFrom="margin">
+                    <wp14:pctWidth>0</wp14:pctWidth>
+                  </wp14:sizeRelH>
+                  <wp14:sizeRelV relativeFrom="margin">
+                    <wp14:pctHeight>0</wp14:pctHeight>
+                  </wp14:sizeRelV>
+                </wp:anchor>
+              </w:drawing>
+            </w:r>
           </w:p>
         </w:tc>
       </w:tr>
@@ -3940,22 +4597,31 @@
                 <w:sz w:val="18"/>
                 <w:szCs w:val="18"/>
               </w:rPr>
-              <w:t>10</w:t>
+              <w:t>12</w:t>
             </w:r>
           </w:p>
         </w:tc>
         <w:tc>
           <w:tcPr>
             <w:tcW w:w="3414" w:type="dxa"/>
-          </w:tcPr>
-          <w:p>
-            <w:pPr>
-              <w:rPr>
-                <w:rFonts w:ascii="Arial" w:hAnsi="Arial" w:cs="Arial"/>
-                <w:sz w:val="18"/>
-                <w:szCs w:val="18"/>
-              </w:rPr>
-            </w:pPr>
+            <w:gridSpan w:val="2"/>
+          </w:tcPr>
+          <w:p>
+            <w:pPr>
+              <w:rPr>
+                <w:rFonts w:ascii="Arial" w:hAnsi="Arial" w:cs="Arial"/>
+                <w:sz w:val="18"/>
+                <w:szCs w:val="18"/>
+              </w:rPr>
+            </w:pPr>
+            <w:r>
+              <w:rPr>
+                <w:rFonts w:ascii="Arial" w:hAnsi="Arial" w:cs="Arial"/>
+                <w:sz w:val="18"/>
+                <w:szCs w:val="18"/>
+              </w:rPr>
+              <w:t>Jose Daniel Garzon Bernal</w:t>
+            </w:r>
           </w:p>
         </w:tc>
         <w:tc>
@@ -3970,6 +4636,14 @@
                 <w:szCs w:val="18"/>
               </w:rPr>
             </w:pPr>
+            <w:r>
+              <w:rPr>
+                <w:rFonts w:ascii="Arial" w:hAnsi="Arial" w:cs="Arial"/>
+                <w:sz w:val="18"/>
+                <w:szCs w:val="18"/>
+              </w:rPr>
+              <w:t>1000157939</w:t>
+            </w:r>
           </w:p>
         </w:tc>
         <w:tc>
@@ -3977,13 +4651,52 @@
             <w:tcW w:w="3402" w:type="dxa"/>
           </w:tcPr>
           <w:p>
-            <w:pPr>
-              <w:rPr>
-                <w:rFonts w:ascii="Arial" w:hAnsi="Arial" w:cs="Arial"/>
-                <w:sz w:val="18"/>
-                <w:szCs w:val="18"/>
-              </w:rPr>
-            </w:pPr>
+            <w:r>
+              <w:rPr>
+                <w:noProof/>
+              </w:rPr>
+              <w:drawing>
+                <wp:inline distT="0" distB="0" distL="0" distR="0" wp14:anchorId="66D46FB6" wp14:editId="0203C0AA">
+                  <wp:extent cx="1987448" cy="398776"/>
+                  <wp:effectExtent l="0" t="0" r="0" b="0"/>
+                  <wp:docPr id="1121181613" name="drawing"/>
+                  <wp:cNvGraphicFramePr>
+                    <a:graphicFrameLocks xmlns:a="http://schemas.openxmlformats.org/drawingml/2006/main" noChangeAspect="1"/>
+                  </wp:cNvGraphicFramePr>
+                  <a:graphic xmlns:a="http://schemas.openxmlformats.org/drawingml/2006/main">
+                    <a:graphicData uri="http://schemas.openxmlformats.org/drawingml/2006/picture">
+                      <pic:pic xmlns:pic="http://schemas.openxmlformats.org/drawingml/2006/picture">
+                        <pic:nvPicPr>
+                          <pic:cNvPr id="1121181613" name="Picture 1121181613"/>
+                          <pic:cNvPicPr/>
+                        </pic:nvPicPr>
+                        <pic:blipFill>
+                          <a:blip r:embed="rId16">
+                            <a:extLst>
+                              <a:ext uri="{28A0092B-C50C-407E-A947-70E740481C1C}">
+                                <a14:useLocalDpi xmlns:a14="http://schemas.microsoft.com/office/drawing/2010/main"/>
+                              </a:ext>
+                            </a:extLst>
+                          </a:blip>
+                          <a:stretch>
+                            <a:fillRect/>
+                          </a:stretch>
+                        </pic:blipFill>
+                        <pic:spPr>
+                          <a:xfrm>
+                            <a:off x="0" y="0"/>
+                            <a:ext cx="1987448" cy="398776"/>
+                          </a:xfrm>
+                          <a:prstGeom prst="rect">
+                            <a:avLst/>
+                          </a:prstGeom>
+                        </pic:spPr>
+                      </pic:pic>
+                    </a:graphicData>
+                  </a:graphic>
+                </wp:inline>
+              </w:drawing>
+            </w:r>
           </w:p>
         </w:tc>
       </w:tr>
@@ -4010,22 +4723,31 @@
                 <w:sz w:val="18"/>
                 <w:szCs w:val="18"/>
               </w:rPr>
-              <w:t>11</w:t>
+              <w:t>13</w:t>
             </w:r>
           </w:p>
         </w:tc>
         <w:tc>
           <w:tcPr>
             <w:tcW w:w="3414" w:type="dxa"/>
-          </w:tcPr>
-          <w:p>
-            <w:pPr>
-              <w:rPr>
-                <w:rFonts w:ascii="Arial" w:hAnsi="Arial" w:cs="Arial"/>
-                <w:sz w:val="18"/>
-                <w:szCs w:val="18"/>
-              </w:rPr>
-            </w:pPr>
+            <w:gridSpan w:val="2"/>
+          </w:tcPr>
+          <w:p>
+            <w:pPr>
+              <w:rPr>
+                <w:rFonts w:ascii="Arial" w:hAnsi="Arial" w:cs="Arial"/>
+                <w:sz w:val="18"/>
+                <w:szCs w:val="18"/>
+              </w:rPr>
+            </w:pPr>
+            <w:r>
+              <w:rPr>
+                <w:rFonts w:ascii="Arial" w:hAnsi="Arial" w:cs="Arial"/>
+                <w:sz w:val="18"/>
+                <w:szCs w:val="18"/>
+              </w:rPr>
+              <w:t>Edison David Olaya Velasco</w:t>
+            </w:r>
           </w:p>
         </w:tc>
         <w:tc>
@@ -4040,20 +4762,69 @@
                 <w:szCs w:val="18"/>
               </w:rPr>
             </w:pPr>
+            <w:r>
+              <w:rPr>
+                <w:rFonts w:ascii="Arial" w:hAnsi="Arial" w:cs="Arial"/>
+                <w:sz w:val="18"/>
+                <w:szCs w:val="18"/>
+              </w:rPr>
+              <w:t>1015448311</w:t>
+            </w:r>
           </w:p>
         </w:tc>
         <w:tc>
           <w:tcPr>
             <w:tcW w:w="3402" w:type="dxa"/>
           </w:tcPr>
-          <w:p>
-            <w:pPr>
-              <w:rPr>
-                <w:rFonts w:ascii="Arial" w:hAnsi="Arial" w:cs="Arial"/>
-                <w:sz w:val="18"/>
-                <w:szCs w:val="18"/>
-              </w:rPr>
-            </w:pPr>
+          <w:p/>
+          <w:p>
+            <w:r>
+              <w:rPr>
+                <w:noProof/>
+              </w:rPr>
+              <w:drawing>
+                <wp:inline distT="0" distB="0" distL="0" distR="0" wp14:anchorId="0DBC2C35" wp14:editId="1AD2BD78">
+                  <wp:extent cx="1983713" cy="676279"/>
+                  <wp:effectExtent l="0" t="0" r="0" b="0"/>
+                  <wp:docPr id="645393154" name="drawing"/>
+                  <wp:cNvGraphicFramePr>
+                    <a:graphicFrameLocks xmlns:a="http://schemas.openxmlformats.org/drawingml/2006/main" noChangeAspect="1"/>
+                  </wp:cNvGraphicFramePr>
+                  <a:graphic xmlns:a="http://schemas.openxmlformats.org/drawingml/2006/main">
+                    <a:graphicData uri="http://schemas.openxmlformats.org/drawingml/2006/picture">
+                      <pic:pic xmlns:pic="http://schemas.openxmlformats.org/drawingml/2006/picture">
+                        <pic:nvPicPr>
+                          <pic:cNvPr id="645393154" name="Picture 645393154"/>
+                          <pic:cNvPicPr/>
+                        </pic:nvPicPr>
+                        <pic:blipFill>
+                          <a:blip r:embed="rId17">
+                            <a:extLst>
+                              <a:ext uri="{28A0092B-C50C-407E-A947-70E740481C1C}">
+                                <a14:useLocalDpi xmlns:a14="http://schemas.microsoft.com/office/drawing/2010/main"/>
+                              </a:ext>
+                            </a:extLst>
+                          </a:blip>
+                          <a:srcRect l="11320" t="20000" r="11792" b="36774"/>
+                          <a:stretch>
+                            <a:fillRect/>
+                          </a:stretch>
+                        </pic:blipFill>
+                        <pic:spPr>
+                          <a:xfrm>
+                            <a:off x="0" y="0"/>
+                            <a:ext cx="1983713" cy="676279"/>
+                          </a:xfrm>
+                          <a:prstGeom prst="rect">
+                            <a:avLst/>
+                          </a:prstGeom>
+                        </pic:spPr>
+                      </pic:pic>
+                    </a:graphicData>
+                  </a:graphic>
+                </wp:inline>
+              </w:drawing>
+            </w:r>
           </w:p>
         </w:tc>
       </w:tr>
@@ -4080,22 +4851,31 @@
                 <w:sz w:val="18"/>
                 <w:szCs w:val="18"/>
               </w:rPr>
-              <w:t>12</w:t>
+              <w:t>14</w:t>
             </w:r>
           </w:p>
         </w:tc>
         <w:tc>
           <w:tcPr>
             <w:tcW w:w="3414" w:type="dxa"/>
-          </w:tcPr>
-          <w:p>
-            <w:pPr>
-              <w:rPr>
-                <w:rFonts w:ascii="Arial" w:hAnsi="Arial" w:cs="Arial"/>
-                <w:sz w:val="18"/>
-                <w:szCs w:val="18"/>
-              </w:rPr>
-            </w:pPr>
+            <w:gridSpan w:val="2"/>
+          </w:tcPr>
+          <w:p>
+            <w:pPr>
+              <w:rPr>
+                <w:rFonts w:ascii="Arial" w:hAnsi="Arial" w:cs="Arial"/>
+                <w:sz w:val="18"/>
+                <w:szCs w:val="18"/>
+              </w:rPr>
+            </w:pPr>
+            <w:r>
+              <w:rPr>
+                <w:rFonts w:ascii="Arial" w:hAnsi="Arial" w:cs="Arial"/>
+                <w:sz w:val="18"/>
+                <w:szCs w:val="18"/>
+              </w:rPr>
+              <w:t>Solangie Ochoa Cruz</w:t>
+            </w:r>
           </w:p>
         </w:tc>
         <w:tc>
@@ -4110,6 +4890,14 @@
                 <w:szCs w:val="18"/>
               </w:rPr>
             </w:pPr>
+            <w:r>
+              <w:rPr>
+                <w:rFonts w:ascii="Arial" w:hAnsi="Arial" w:cs="Arial"/>
+                <w:sz w:val="18"/>
+                <w:szCs w:val="18"/>
+              </w:rPr>
+              <w:t>1070989414</w:t>
+            </w:r>
           </w:p>
         </w:tc>
         <w:tc>
@@ -4117,13 +4905,52 @@
             <w:tcW w:w="3402" w:type="dxa"/>
           </w:tcPr>
           <w:p>
-            <w:pPr>
-              <w:rPr>
-                <w:rFonts w:ascii="Arial" w:hAnsi="Arial" w:cs="Arial"/>
-                <w:sz w:val="18"/>
-                <w:szCs w:val="18"/>
-              </w:rPr>
-            </w:pPr>
+            <w:r>
+              <w:rPr>
+                <w:noProof/>
+              </w:rPr>
+              <w:drawing>
+                <wp:inline distT="0" distB="0" distL="0" distR="0" wp14:anchorId="6CEF1D78" wp14:editId="7E786C60">
+                  <wp:extent cx="2019300" cy="647700"/>
+                  <wp:effectExtent l="0" t="0" r="0" b="0"/>
+                  <wp:docPr id="2127530839" name="drawing"/>
+                  <wp:cNvGraphicFramePr>
+                    <a:graphicFrameLocks xmlns:a="http://schemas.openxmlformats.org/drawingml/2006/main" noChangeAspect="1"/>
+                  </wp:cNvGraphicFramePr>
+                  <a:graphic xmlns:a="http://schemas.openxmlformats.org/drawingml/2006/main">
+                    <a:graphicData uri="http://schemas.openxmlformats.org/drawingml/2006/picture">
+                      <pic:pic xmlns:pic="http://schemas.openxmlformats.org/drawingml/2006/picture">
+                        <pic:nvPicPr>
+                          <pic:cNvPr id="2127530839" name="Picture 2127530839"/>
+                          <pic:cNvPicPr/>
+                        </pic:nvPicPr>
+                        <pic:blipFill>
+                          <a:blip r:embed="rId18">
+                            <a:extLst>
+                              <a:ext uri="{28A0092B-C50C-407E-A947-70E740481C1C}">
+                                <a14:useLocalDpi xmlns:a14="http://schemas.microsoft.com/office/drawing/2010/main"/>
+                              </a:ext>
+                            </a:extLst>
+                          </a:blip>
+                          <a:stretch>
+                            <a:fillRect/>
+                          </a:stretch>
+                        </pic:blipFill>
+                        <pic:spPr>
+                          <a:xfrm>
+                            <a:off x="0" y="0"/>
+                            <a:ext cx="2019300" cy="647700"/>
+                          </a:xfrm>
+                          <a:prstGeom prst="rect">
+                            <a:avLst/>
+                          </a:prstGeom>
+                        </pic:spPr>
+                      </pic:pic>
+                    </a:graphicData>
+                  </a:graphic>
+                </wp:inline>
+              </w:drawing>
+            </w:r>
           </w:p>
         </w:tc>
       </w:tr>
@@ -4150,13 +4977,14 @@
                 <w:sz w:val="18"/>
                 <w:szCs w:val="18"/>
               </w:rPr>
-              <w:t>13</w:t>
+              <w:t>15</w:t>
             </w:r>
           </w:p>
         </w:tc>
         <w:tc>
           <w:tcPr>
             <w:tcW w:w="3414" w:type="dxa"/>
+            <w:gridSpan w:val="2"/>
           </w:tcPr>
           <w:p>
             <w:pPr>
@@ -4220,13 +5048,14 @@
                 <w:sz w:val="18"/>
                 <w:szCs w:val="18"/>
               </w:rPr>
-              <w:t>14</w:t>
+              <w:t>16</w:t>
             </w:r>
           </w:p>
         </w:tc>
         <w:tc>
           <w:tcPr>
             <w:tcW w:w="3414" w:type="dxa"/>
+            <w:gridSpan w:val="2"/>
           </w:tcPr>
           <w:p>
             <w:pPr>
@@ -4290,13 +5119,14 @@
                 <w:sz w:val="18"/>
                 <w:szCs w:val="18"/>
               </w:rPr>
-              <w:t>15</w:t>
+              <w:t>17</w:t>
             </w:r>
           </w:p>
         </w:tc>
         <w:tc>
           <w:tcPr>
             <w:tcW w:w="3414" w:type="dxa"/>
+            <w:gridSpan w:val="2"/>
           </w:tcPr>
           <w:p>
             <w:pPr>
@@ -4360,13 +5190,14 @@
                 <w:sz w:val="18"/>
                 <w:szCs w:val="18"/>
               </w:rPr>
-              <w:t>16</w:t>
+              <w:t>18</w:t>
             </w:r>
           </w:p>
         </w:tc>
         <w:tc>
           <w:tcPr>
             <w:tcW w:w="3414" w:type="dxa"/>
+            <w:gridSpan w:val="2"/>
           </w:tcPr>
           <w:p>
             <w:pPr>
@@ -4430,13 +5261,14 @@
                 <w:sz w:val="18"/>
                 <w:szCs w:val="18"/>
               </w:rPr>
-              <w:t>17</w:t>
+              <w:t>19</w:t>
             </w:r>
           </w:p>
         </w:tc>
         <w:tc>
           <w:tcPr>
             <w:tcW w:w="3414" w:type="dxa"/>
+            <w:gridSpan w:val="2"/>
           </w:tcPr>
           <w:p>
             <w:pPr>
@@ -4500,13 +5332,14 @@
                 <w:sz w:val="18"/>
                 <w:szCs w:val="18"/>
               </w:rPr>
-              <w:t>18</w:t>
+              <w:t>20</w:t>
             </w:r>
           </w:p>
         </w:tc>
         <w:tc>
           <w:tcPr>
             <w:tcW w:w="3414" w:type="dxa"/>
+            <w:gridSpan w:val="2"/>
           </w:tcPr>
           <w:p>
             <w:pPr>
@@ -4570,13 +5403,14 @@
                 <w:sz w:val="18"/>
                 <w:szCs w:val="18"/>
               </w:rPr>
-              <w:t>19</w:t>
+              <w:t>21</w:t>
             </w:r>
           </w:p>
         </w:tc>
         <w:tc>
           <w:tcPr>
             <w:tcW w:w="3414" w:type="dxa"/>
+            <w:gridSpan w:val="2"/>
           </w:tcPr>
           <w:p>
             <w:pPr>
@@ -4640,13 +5474,14 @@
                 <w:sz w:val="18"/>
                 <w:szCs w:val="18"/>
               </w:rPr>
-              <w:t>20</w:t>
+              <w:t>22</w:t>
             </w:r>
           </w:p>
         </w:tc>
         <w:tc>
           <w:tcPr>
             <w:tcW w:w="3414" w:type="dxa"/>
+            <w:gridSpan w:val="2"/>
           </w:tcPr>
           <w:p>
             <w:pPr>
@@ -4710,13 +5545,14 @@
                 <w:sz w:val="18"/>
                 <w:szCs w:val="18"/>
               </w:rPr>
-              <w:t>21</w:t>
+              <w:t>23</w:t>
             </w:r>
           </w:p>
         </w:tc>
         <w:tc>
           <w:tcPr>
             <w:tcW w:w="3414" w:type="dxa"/>
+            <w:gridSpan w:val="2"/>
           </w:tcPr>
           <w:p>
             <w:pPr>
@@ -4780,13 +5616,14 @@
                 <w:sz w:val="18"/>
                 <w:szCs w:val="18"/>
               </w:rPr>
-              <w:t>22</w:t>
+              <w:t>24</w:t>
             </w:r>
           </w:p>
         </w:tc>
         <w:tc>
           <w:tcPr>
             <w:tcW w:w="3414" w:type="dxa"/>
+            <w:gridSpan w:val="2"/>
           </w:tcPr>
           <w:p>
             <w:pPr>
@@ -4850,853 +5687,14 @@
                 <w:sz w:val="18"/>
                 <w:szCs w:val="18"/>
               </w:rPr>
-              <w:t>23</w:t>
+              <w:t>25</w:t>
             </w:r>
           </w:p>
         </w:tc>
         <w:tc>
           <w:tcPr>
             <w:tcW w:w="3414" w:type="dxa"/>
-          </w:tcPr>
-          <w:p>
-            <w:pPr>
-              <w:rPr>
-                <w:rFonts w:ascii="Arial" w:hAnsi="Arial" w:cs="Arial"/>
-                <w:sz w:val="18"/>
-                <w:szCs w:val="18"/>
-              </w:rPr>
-            </w:pPr>
-          </w:p>
-        </w:tc>
-        <w:tc>
-          <w:tcPr>
-            <w:tcW w:w="1843" w:type="dxa"/>
-          </w:tcPr>
-          <w:p>
-            <w:pPr>
-              <w:rPr>
-                <w:rFonts w:ascii="Arial" w:hAnsi="Arial" w:cs="Arial"/>
-                <w:sz w:val="18"/>
-                <w:szCs w:val="18"/>
-              </w:rPr>
-            </w:pPr>
-          </w:p>
-        </w:tc>
-        <w:tc>
-          <w:tcPr>
-            <w:tcW w:w="3402" w:type="dxa"/>
-          </w:tcPr>
-          <w:p>
-            <w:pPr>
-              <w:rPr>
-                <w:rFonts w:ascii="Arial" w:hAnsi="Arial" w:cs="Arial"/>
-                <w:sz w:val="18"/>
-                <w:szCs w:val="18"/>
-              </w:rPr>
-            </w:pPr>
-          </w:p>
-        </w:tc>
-      </w:tr>
-      <w:tr>
-        <w:trPr>
-          <w:trHeight w:val="284"/>
-        </w:trPr>
-        <w:tc>
-          <w:tcPr>
-            <w:tcW w:w="550" w:type="dxa"/>
-          </w:tcPr>
-          <w:p>
-            <w:pPr>
-              <w:jc w:val="center"/>
-              <w:rPr>
-                <w:rFonts w:ascii="Arial" w:hAnsi="Arial" w:cs="Arial"/>
-                <w:sz w:val="18"/>
-                <w:szCs w:val="18"/>
-              </w:rPr>
-            </w:pPr>
-            <w:r>
-              <w:rPr>
-                <w:rFonts w:ascii="Arial" w:hAnsi="Arial" w:cs="Arial"/>
-                <w:sz w:val="18"/>
-                <w:szCs w:val="18"/>
-              </w:rPr>
-              <w:t>24</w:t>
-            </w:r>
-          </w:p>
-        </w:tc>
-        <w:tc>
-          <w:tcPr>
-            <w:tcW w:w="3414" w:type="dxa"/>
-          </w:tcPr>
-          <w:p>
-            <w:pPr>
-              <w:rPr>
-                <w:rFonts w:ascii="Arial" w:hAnsi="Arial" w:cs="Arial"/>
-                <w:sz w:val="18"/>
-                <w:szCs w:val="18"/>
-              </w:rPr>
-            </w:pPr>
-          </w:p>
-        </w:tc>
-        <w:tc>
-          <w:tcPr>
-            <w:tcW w:w="1843" w:type="dxa"/>
-          </w:tcPr>
-          <w:p>
-            <w:pPr>
-              <w:rPr>
-                <w:rFonts w:ascii="Arial" w:hAnsi="Arial" w:cs="Arial"/>
-                <w:sz w:val="18"/>
-                <w:szCs w:val="18"/>
-              </w:rPr>
-            </w:pPr>
-          </w:p>
-        </w:tc>
-        <w:tc>
-          <w:tcPr>
-            <w:tcW w:w="3402" w:type="dxa"/>
-          </w:tcPr>
-          <w:p>
-            <w:pPr>
-              <w:rPr>
-                <w:rFonts w:ascii="Arial" w:hAnsi="Arial" w:cs="Arial"/>
-                <w:sz w:val="18"/>
-                <w:szCs w:val="18"/>
-              </w:rPr>
-            </w:pPr>
-          </w:p>
-        </w:tc>
-      </w:tr>
-      <w:tr>
-        <w:trPr>
-          <w:trHeight w:val="284"/>
-        </w:trPr>
-        <w:tc>
-          <w:tcPr>
-            <w:tcW w:w="550" w:type="dxa"/>
-          </w:tcPr>
-          <w:p>
-            <w:pPr>
-              <w:jc w:val="center"/>
-              <w:rPr>
-                <w:rFonts w:ascii="Arial" w:hAnsi="Arial" w:cs="Arial"/>
-                <w:sz w:val="18"/>
-                <w:szCs w:val="18"/>
-              </w:rPr>
-            </w:pPr>
-            <w:r>
-              <w:rPr>
-                <w:rFonts w:ascii="Arial" w:hAnsi="Arial" w:cs="Arial"/>
-                <w:sz w:val="18"/>
-                <w:szCs w:val="18"/>
-              </w:rPr>
-              <w:t>25</w:t>
-            </w:r>
-          </w:p>
-        </w:tc>
-        <w:tc>
-          <w:tcPr>
-            <w:tcW w:w="3414" w:type="dxa"/>
-          </w:tcPr>
-          <w:p>
-            <w:pPr>
-              <w:rPr>
-                <w:rFonts w:ascii="Arial" w:hAnsi="Arial" w:cs="Arial"/>
-                <w:sz w:val="18"/>
-                <w:szCs w:val="18"/>
-              </w:rPr>
-            </w:pPr>
-          </w:p>
-        </w:tc>
-        <w:tc>
-          <w:tcPr>
-            <w:tcW w:w="1843" w:type="dxa"/>
-          </w:tcPr>
-          <w:p>
-            <w:pPr>
-              <w:rPr>
-                <w:rFonts w:ascii="Arial" w:hAnsi="Arial" w:cs="Arial"/>
-                <w:sz w:val="18"/>
-                <w:szCs w:val="18"/>
-              </w:rPr>
-            </w:pPr>
-          </w:p>
-        </w:tc>
-        <w:tc>
-          <w:tcPr>
-            <w:tcW w:w="3402" w:type="dxa"/>
-          </w:tcPr>
-          <w:p>
-            <w:pPr>
-              <w:rPr>
-                <w:rFonts w:ascii="Arial" w:hAnsi="Arial" w:cs="Arial"/>
-                <w:sz w:val="18"/>
-                <w:szCs w:val="18"/>
-              </w:rPr>
-            </w:pPr>
-          </w:p>
-        </w:tc>
-      </w:tr>
-      <w:tr>
-        <w:trPr>
-          <w:trHeight w:val="284"/>
-        </w:trPr>
-        <w:tc>
-          <w:tcPr>
-            <w:tcW w:w="550" w:type="dxa"/>
-          </w:tcPr>
-          <w:p>
-            <w:pPr>
-              <w:jc w:val="center"/>
-              <w:rPr>
-                <w:rFonts w:ascii="Arial" w:hAnsi="Arial" w:cs="Arial"/>
-                <w:sz w:val="18"/>
-                <w:szCs w:val="18"/>
-              </w:rPr>
-            </w:pPr>
-            <w:r>
-              <w:rPr>
-                <w:rFonts w:ascii="Arial" w:hAnsi="Arial" w:cs="Arial"/>
-                <w:sz w:val="18"/>
-                <w:szCs w:val="18"/>
-              </w:rPr>
-              <w:t>26</w:t>
-            </w:r>
-          </w:p>
-        </w:tc>
-        <w:tc>
-          <w:tcPr>
-            <w:tcW w:w="3414" w:type="dxa"/>
-          </w:tcPr>
-          <w:p>
-            <w:pPr>
-              <w:rPr>
-                <w:rFonts w:ascii="Arial" w:hAnsi="Arial" w:cs="Arial"/>
-                <w:sz w:val="18"/>
-                <w:szCs w:val="18"/>
-              </w:rPr>
-            </w:pPr>
-          </w:p>
-        </w:tc>
-        <w:tc>
-          <w:tcPr>
-            <w:tcW w:w="1843" w:type="dxa"/>
-          </w:tcPr>
-          <w:p>
-            <w:pPr>
-              <w:rPr>
-                <w:rFonts w:ascii="Arial" w:hAnsi="Arial" w:cs="Arial"/>
-                <w:sz w:val="18"/>
-                <w:szCs w:val="18"/>
-              </w:rPr>
-            </w:pPr>
-          </w:p>
-        </w:tc>
-        <w:tc>
-          <w:tcPr>
-            <w:tcW w:w="3402" w:type="dxa"/>
-          </w:tcPr>
-          <w:p>
-            <w:pPr>
-              <w:rPr>
-                <w:rFonts w:ascii="Arial" w:hAnsi="Arial" w:cs="Arial"/>
-                <w:sz w:val="18"/>
-                <w:szCs w:val="18"/>
-              </w:rPr>
-            </w:pPr>
-          </w:p>
-        </w:tc>
-      </w:tr>
-      <w:tr>
-        <w:trPr>
-          <w:trHeight w:val="284"/>
-        </w:trPr>
-        <w:tc>
-          <w:tcPr>
-            <w:tcW w:w="550" w:type="dxa"/>
-          </w:tcPr>
-          <w:p>
-            <w:pPr>
-              <w:jc w:val="center"/>
-              <w:rPr>
-                <w:rFonts w:ascii="Arial" w:hAnsi="Arial" w:cs="Arial"/>
-                <w:sz w:val="18"/>
-                <w:szCs w:val="18"/>
-              </w:rPr>
-            </w:pPr>
-            <w:r>
-              <w:rPr>
-                <w:rFonts w:ascii="Arial" w:hAnsi="Arial" w:cs="Arial"/>
-                <w:sz w:val="18"/>
-                <w:szCs w:val="18"/>
-              </w:rPr>
-              <w:t>27</w:t>
-            </w:r>
-          </w:p>
-        </w:tc>
-        <w:tc>
-          <w:tcPr>
-            <w:tcW w:w="3414" w:type="dxa"/>
-          </w:tcPr>
-          <w:p>
-            <w:pPr>
-              <w:rPr>
-                <w:rFonts w:ascii="Arial" w:hAnsi="Arial" w:cs="Arial"/>
-                <w:sz w:val="18"/>
-                <w:szCs w:val="18"/>
-              </w:rPr>
-            </w:pPr>
-          </w:p>
-        </w:tc>
-        <w:tc>
-          <w:tcPr>
-            <w:tcW w:w="1843" w:type="dxa"/>
-          </w:tcPr>
-          <w:p>
-            <w:pPr>
-              <w:rPr>
-                <w:rFonts w:ascii="Arial" w:hAnsi="Arial" w:cs="Arial"/>
-                <w:sz w:val="18"/>
-                <w:szCs w:val="18"/>
-              </w:rPr>
-            </w:pPr>
-          </w:p>
-        </w:tc>
-        <w:tc>
-          <w:tcPr>
-            <w:tcW w:w="3402" w:type="dxa"/>
-          </w:tcPr>
-          <w:p>
-            <w:pPr>
-              <w:rPr>
-                <w:rFonts w:ascii="Arial" w:hAnsi="Arial" w:cs="Arial"/>
-                <w:sz w:val="18"/>
-                <w:szCs w:val="18"/>
-              </w:rPr>
-            </w:pPr>
-          </w:p>
-        </w:tc>
-      </w:tr>
-      <w:tr>
-        <w:trPr>
-          <w:trHeight w:val="284"/>
-        </w:trPr>
-        <w:tc>
-          <w:tcPr>
-            <w:tcW w:w="550" w:type="dxa"/>
-          </w:tcPr>
-          <w:p>
-            <w:pPr>
-              <w:jc w:val="center"/>
-              <w:rPr>
-                <w:rFonts w:ascii="Arial" w:hAnsi="Arial" w:cs="Arial"/>
-                <w:sz w:val="18"/>
-                <w:szCs w:val="18"/>
-              </w:rPr>
-            </w:pPr>
-            <w:r>
-              <w:rPr>
-                <w:rFonts w:ascii="Arial" w:hAnsi="Arial" w:cs="Arial"/>
-                <w:sz w:val="18"/>
-                <w:szCs w:val="18"/>
-              </w:rPr>
-              <w:t>28</w:t>
-            </w:r>
-          </w:p>
-        </w:tc>
-        <w:tc>
-          <w:tcPr>
-            <w:tcW w:w="3414" w:type="dxa"/>
-          </w:tcPr>
-          <w:p>
-            <w:pPr>
-              <w:rPr>
-                <w:rFonts w:ascii="Arial" w:hAnsi="Arial" w:cs="Arial"/>
-                <w:sz w:val="18"/>
-                <w:szCs w:val="18"/>
-              </w:rPr>
-            </w:pPr>
-          </w:p>
-        </w:tc>
-        <w:tc>
-          <w:tcPr>
-            <w:tcW w:w="1843" w:type="dxa"/>
-          </w:tcPr>
-          <w:p>
-            <w:pPr>
-              <w:rPr>
-                <w:rFonts w:ascii="Arial" w:hAnsi="Arial" w:cs="Arial"/>
-                <w:sz w:val="18"/>
-                <w:szCs w:val="18"/>
-              </w:rPr>
-            </w:pPr>
-          </w:p>
-        </w:tc>
-        <w:tc>
-          <w:tcPr>
-            <w:tcW w:w="3402" w:type="dxa"/>
-          </w:tcPr>
-          <w:p>
-            <w:pPr>
-              <w:rPr>
-                <w:rFonts w:ascii="Arial" w:hAnsi="Arial" w:cs="Arial"/>
-                <w:sz w:val="18"/>
-                <w:szCs w:val="18"/>
-              </w:rPr>
-            </w:pPr>
-          </w:p>
-        </w:tc>
-      </w:tr>
-      <w:tr>
-        <w:trPr>
-          <w:trHeight w:val="284"/>
-        </w:trPr>
-        <w:tc>
-          <w:tcPr>
-            <w:tcW w:w="550" w:type="dxa"/>
-          </w:tcPr>
-          <w:p>
-            <w:pPr>
-              <w:jc w:val="center"/>
-              <w:rPr>
-                <w:rFonts w:ascii="Arial" w:hAnsi="Arial" w:cs="Arial"/>
-                <w:sz w:val="18"/>
-                <w:szCs w:val="18"/>
-              </w:rPr>
-            </w:pPr>
-            <w:r>
-              <w:rPr>
-                <w:rFonts w:ascii="Arial" w:hAnsi="Arial" w:cs="Arial"/>
-                <w:sz w:val="18"/>
-                <w:szCs w:val="18"/>
-              </w:rPr>
-              <w:t>29</w:t>
-            </w:r>
-          </w:p>
-        </w:tc>
-        <w:tc>
-          <w:tcPr>
-            <w:tcW w:w="3414" w:type="dxa"/>
-          </w:tcPr>
-          <w:p>
-            <w:pPr>
-              <w:rPr>
-                <w:rFonts w:ascii="Arial" w:hAnsi="Arial" w:cs="Arial"/>
-                <w:sz w:val="18"/>
-                <w:szCs w:val="18"/>
-              </w:rPr>
-            </w:pPr>
-          </w:p>
-        </w:tc>
-        <w:tc>
-          <w:tcPr>
-            <w:tcW w:w="1843" w:type="dxa"/>
-          </w:tcPr>
-          <w:p>
-            <w:pPr>
-              <w:rPr>
-                <w:rFonts w:ascii="Arial" w:hAnsi="Arial" w:cs="Arial"/>
-                <w:sz w:val="18"/>
-                <w:szCs w:val="18"/>
-              </w:rPr>
-            </w:pPr>
-          </w:p>
-        </w:tc>
-        <w:tc>
-          <w:tcPr>
-            <w:tcW w:w="3402" w:type="dxa"/>
-          </w:tcPr>
-          <w:p>
-            <w:pPr>
-              <w:rPr>
-                <w:rFonts w:ascii="Arial" w:hAnsi="Arial" w:cs="Arial"/>
-                <w:sz w:val="18"/>
-                <w:szCs w:val="18"/>
-              </w:rPr>
-            </w:pPr>
-          </w:p>
-        </w:tc>
-      </w:tr>
-      <w:tr>
-        <w:trPr>
-          <w:trHeight w:val="284"/>
-        </w:trPr>
-        <w:tc>
-          <w:tcPr>
-            <w:tcW w:w="550" w:type="dxa"/>
-          </w:tcPr>
-          <w:p>
-            <w:pPr>
-              <w:jc w:val="center"/>
-              <w:rPr>
-                <w:rFonts w:ascii="Arial" w:hAnsi="Arial" w:cs="Arial"/>
-                <w:sz w:val="18"/>
-                <w:szCs w:val="18"/>
-              </w:rPr>
-            </w:pPr>
-            <w:r>
-              <w:rPr>
-                <w:rFonts w:ascii="Arial" w:hAnsi="Arial" w:cs="Arial"/>
-                <w:sz w:val="18"/>
-                <w:szCs w:val="18"/>
-              </w:rPr>
-              <w:t>30</w:t>
-            </w:r>
-          </w:p>
-        </w:tc>
-        <w:tc>
-          <w:tcPr>
-            <w:tcW w:w="3414" w:type="dxa"/>
-          </w:tcPr>
-          <w:p>
-            <w:pPr>
-              <w:rPr>
-                <w:rFonts w:ascii="Arial" w:hAnsi="Arial" w:cs="Arial"/>
-                <w:sz w:val="18"/>
-                <w:szCs w:val="18"/>
-              </w:rPr>
-            </w:pPr>
-          </w:p>
-        </w:tc>
-        <w:tc>
-          <w:tcPr>
-            <w:tcW w:w="1843" w:type="dxa"/>
-          </w:tcPr>
-          <w:p>
-            <w:pPr>
-              <w:rPr>
-                <w:rFonts w:ascii="Arial" w:hAnsi="Arial" w:cs="Arial"/>
-                <w:sz w:val="18"/>
-                <w:szCs w:val="18"/>
-              </w:rPr>
-            </w:pPr>
-          </w:p>
-        </w:tc>
-        <w:tc>
-          <w:tcPr>
-            <w:tcW w:w="3402" w:type="dxa"/>
-          </w:tcPr>
-          <w:p>
-            <w:pPr>
-              <w:rPr>
-                <w:rFonts w:ascii="Arial" w:hAnsi="Arial" w:cs="Arial"/>
-                <w:sz w:val="18"/>
-                <w:szCs w:val="18"/>
-              </w:rPr>
-            </w:pPr>
-          </w:p>
-        </w:tc>
-      </w:tr>
-      <w:tr>
-        <w:trPr>
-          <w:trHeight w:val="284"/>
-        </w:trPr>
-        <w:tc>
-          <w:tcPr>
-            <w:tcW w:w="550" w:type="dxa"/>
-          </w:tcPr>
-          <w:p>
-            <w:pPr>
-              <w:jc w:val="center"/>
-              <w:rPr>
-                <w:rFonts w:ascii="Arial" w:hAnsi="Arial" w:cs="Arial"/>
-                <w:sz w:val="18"/>
-                <w:szCs w:val="18"/>
-              </w:rPr>
-            </w:pPr>
-            <w:r>
-              <w:rPr>
-                <w:rFonts w:ascii="Arial" w:hAnsi="Arial" w:cs="Arial"/>
-                <w:sz w:val="18"/>
-                <w:szCs w:val="18"/>
-              </w:rPr>
-              <w:t>31</w:t>
-            </w:r>
-          </w:p>
-        </w:tc>
-        <w:tc>
-          <w:tcPr>
-            <w:tcW w:w="3414" w:type="dxa"/>
-          </w:tcPr>
-          <w:p>
-            <w:pPr>
-              <w:rPr>
-                <w:rFonts w:ascii="Arial" w:hAnsi="Arial" w:cs="Arial"/>
-                <w:sz w:val="18"/>
-                <w:szCs w:val="18"/>
-              </w:rPr>
-            </w:pPr>
-          </w:p>
-        </w:tc>
-        <w:tc>
-          <w:tcPr>
-            <w:tcW w:w="1843" w:type="dxa"/>
-          </w:tcPr>
-          <w:p>
-            <w:pPr>
-              <w:rPr>
-                <w:rFonts w:ascii="Arial" w:hAnsi="Arial" w:cs="Arial"/>
-                <w:sz w:val="18"/>
-                <w:szCs w:val="18"/>
-              </w:rPr>
-            </w:pPr>
-          </w:p>
-        </w:tc>
-        <w:tc>
-          <w:tcPr>
-            <w:tcW w:w="3402" w:type="dxa"/>
-          </w:tcPr>
-          <w:p>
-            <w:pPr>
-              <w:rPr>
-                <w:rFonts w:ascii="Arial" w:hAnsi="Arial" w:cs="Arial"/>
-                <w:sz w:val="18"/>
-                <w:szCs w:val="18"/>
-              </w:rPr>
-            </w:pPr>
-          </w:p>
-        </w:tc>
-      </w:tr>
-      <w:tr>
-        <w:trPr>
-          <w:trHeight w:val="284"/>
-        </w:trPr>
-        <w:tc>
-          <w:tcPr>
-            <w:tcW w:w="550" w:type="dxa"/>
-          </w:tcPr>
-          <w:p>
-            <w:pPr>
-              <w:jc w:val="center"/>
-              <w:rPr>
-                <w:rFonts w:ascii="Arial" w:hAnsi="Arial" w:cs="Arial"/>
-                <w:sz w:val="18"/>
-                <w:szCs w:val="18"/>
-              </w:rPr>
-            </w:pPr>
-            <w:r>
-              <w:rPr>
-                <w:rFonts w:ascii="Arial" w:hAnsi="Arial" w:cs="Arial"/>
-                <w:sz w:val="18"/>
-                <w:szCs w:val="18"/>
-              </w:rPr>
-              <w:t>32</w:t>
-            </w:r>
-          </w:p>
-        </w:tc>
-        <w:tc>
-          <w:tcPr>
-            <w:tcW w:w="3414" w:type="dxa"/>
-          </w:tcPr>
-          <w:p>
-            <w:pPr>
-              <w:rPr>
-                <w:rFonts w:ascii="Arial" w:hAnsi="Arial" w:cs="Arial"/>
-                <w:sz w:val="18"/>
-                <w:szCs w:val="18"/>
-              </w:rPr>
-            </w:pPr>
-          </w:p>
-        </w:tc>
-        <w:tc>
-          <w:tcPr>
-            <w:tcW w:w="1843" w:type="dxa"/>
-          </w:tcPr>
-          <w:p>
-            <w:pPr>
-              <w:rPr>
-                <w:rFonts w:ascii="Arial" w:hAnsi="Arial" w:cs="Arial"/>
-                <w:sz w:val="18"/>
-                <w:szCs w:val="18"/>
-              </w:rPr>
-            </w:pPr>
-          </w:p>
-        </w:tc>
-        <w:tc>
-          <w:tcPr>
-            <w:tcW w:w="3402" w:type="dxa"/>
-          </w:tcPr>
-          <w:p>
-            <w:pPr>
-              <w:rPr>
-                <w:rFonts w:ascii="Arial" w:hAnsi="Arial" w:cs="Arial"/>
-                <w:sz w:val="18"/>
-                <w:szCs w:val="18"/>
-              </w:rPr>
-            </w:pPr>
-          </w:p>
-        </w:tc>
-      </w:tr>
-      <w:tr>
-        <w:trPr>
-          <w:trHeight w:val="284"/>
-        </w:trPr>
-        <w:tc>
-          <w:tcPr>
-            <w:tcW w:w="550" w:type="dxa"/>
-          </w:tcPr>
-          <w:p>
-            <w:pPr>
-              <w:jc w:val="center"/>
-              <w:rPr>
-                <w:rFonts w:ascii="Arial" w:hAnsi="Arial" w:cs="Arial"/>
-                <w:sz w:val="18"/>
-                <w:szCs w:val="18"/>
-              </w:rPr>
-            </w:pPr>
-            <w:r>
-              <w:rPr>
-                <w:rFonts w:ascii="Arial" w:hAnsi="Arial" w:cs="Arial"/>
-                <w:sz w:val="18"/>
-                <w:szCs w:val="18"/>
-              </w:rPr>
-              <w:t>33</w:t>
-            </w:r>
-          </w:p>
-        </w:tc>
-        <w:tc>
-          <w:tcPr>
-            <w:tcW w:w="3414" w:type="dxa"/>
-          </w:tcPr>
-          <w:p>
-            <w:pPr>
-              <w:rPr>
-                <w:rFonts w:ascii="Arial" w:hAnsi="Arial" w:cs="Arial"/>
-                <w:sz w:val="18"/>
-                <w:szCs w:val="18"/>
-              </w:rPr>
-            </w:pPr>
-          </w:p>
-        </w:tc>
-        <w:tc>
-          <w:tcPr>
-            <w:tcW w:w="1843" w:type="dxa"/>
-          </w:tcPr>
-          <w:p>
-            <w:pPr>
-              <w:rPr>
-                <w:rFonts w:ascii="Arial" w:hAnsi="Arial" w:cs="Arial"/>
-                <w:sz w:val="18"/>
-                <w:szCs w:val="18"/>
-              </w:rPr>
-            </w:pPr>
-          </w:p>
-        </w:tc>
-        <w:tc>
-          <w:tcPr>
-            <w:tcW w:w="3402" w:type="dxa"/>
-          </w:tcPr>
-          <w:p>
-            <w:pPr>
-              <w:rPr>
-                <w:rFonts w:ascii="Arial" w:hAnsi="Arial" w:cs="Arial"/>
-                <w:sz w:val="18"/>
-                <w:szCs w:val="18"/>
-              </w:rPr>
-            </w:pPr>
-          </w:p>
-        </w:tc>
-      </w:tr>
-      <w:tr>
-        <w:trPr>
-          <w:trHeight w:val="284"/>
-        </w:trPr>
-        <w:tc>
-          <w:tcPr>
-            <w:tcW w:w="550" w:type="dxa"/>
-          </w:tcPr>
-          <w:p>
-            <w:pPr>
-              <w:jc w:val="center"/>
-              <w:rPr>
-                <w:rFonts w:ascii="Arial" w:hAnsi="Arial" w:cs="Arial"/>
-                <w:sz w:val="18"/>
-                <w:szCs w:val="18"/>
-              </w:rPr>
-            </w:pPr>
-            <w:r>
-              <w:rPr>
-                <w:rFonts w:ascii="Arial" w:hAnsi="Arial" w:cs="Arial"/>
-                <w:sz w:val="18"/>
-                <w:szCs w:val="18"/>
-              </w:rPr>
-              <w:t>34</w:t>
-            </w:r>
-          </w:p>
-        </w:tc>
-        <w:tc>
-          <w:tcPr>
-            <w:tcW w:w="3414" w:type="dxa"/>
-          </w:tcPr>
-          <w:p>
-            <w:pPr>
-              <w:rPr>
-                <w:rFonts w:ascii="Arial" w:hAnsi="Arial" w:cs="Arial"/>
-                <w:sz w:val="18"/>
-                <w:szCs w:val="18"/>
-              </w:rPr>
-            </w:pPr>
-          </w:p>
-        </w:tc>
-        <w:tc>
-          <w:tcPr>
-            <w:tcW w:w="1843" w:type="dxa"/>
-          </w:tcPr>
-          <w:p>
-            <w:pPr>
-              <w:rPr>
-                <w:rFonts w:ascii="Arial" w:hAnsi="Arial" w:cs="Arial"/>
-                <w:sz w:val="18"/>
-                <w:szCs w:val="18"/>
-              </w:rPr>
-            </w:pPr>
-          </w:p>
-        </w:tc>
-        <w:tc>
-          <w:tcPr>
-            <w:tcW w:w="3402" w:type="dxa"/>
-          </w:tcPr>
-          <w:p>
-            <w:pPr>
-              <w:rPr>
-                <w:rFonts w:ascii="Arial" w:hAnsi="Arial" w:cs="Arial"/>
-                <w:sz w:val="18"/>
-                <w:szCs w:val="18"/>
-              </w:rPr>
-            </w:pPr>
-          </w:p>
-        </w:tc>
-      </w:tr>
-      <w:tr>
-        <w:trPr>
-          <w:trHeight w:val="283"/>
-        </w:trPr>
-        <w:tc>
-          <w:tcPr>
-            <w:tcW w:w="550" w:type="dxa"/>
-          </w:tcPr>
-          <w:p>
-            <w:pPr>
-              <w:jc w:val="center"/>
-              <w:rPr>
-                <w:rFonts w:ascii="Arial" w:hAnsi="Arial" w:cs="Arial"/>
-                <w:sz w:val="18"/>
-                <w:szCs w:val="18"/>
-              </w:rPr>
-            </w:pPr>
-            <w:r>
-              <w:rPr>
-                <w:rFonts w:ascii="Arial" w:hAnsi="Arial" w:cs="Arial"/>
-                <w:sz w:val="18"/>
-                <w:szCs w:val="18"/>
-              </w:rPr>
-              <w:t>35</w:t>
-            </w:r>
-          </w:p>
-        </w:tc>
-        <w:tc>
-          <w:tcPr>
-            <w:tcW w:w="3414" w:type="dxa"/>
+            <w:gridSpan w:val="2"/>
           </w:tcPr>
           <w:p>
             <w:pPr>
@@ -5779,9 +5777,8 @@
           <w:sz w:val="2"/>
           <w:szCs w:val="2"/>
         </w:rPr>
-        <w:lastRenderedPageBreak/>
         <w:drawing>
-          <wp:anchor distT="0" distB="0" distL="114300" distR="114300" simplePos="0" relativeHeight="251674624" behindDoc="1" locked="0" layoutInCell="1" allowOverlap="1" wp14:anchorId="0A3B2475" wp14:editId="48274F81">
+          <wp:anchor distT="0" distB="0" distL="114300" distR="114300" simplePos="0" relativeHeight="251658248" behindDoc="1" locked="0" layoutInCell="1" allowOverlap="1" wp14:anchorId="0A3B2475" wp14:editId="48274F81">
             <wp:simplePos x="0" y="0"/>
             <wp:positionH relativeFrom="column">
               <wp:posOffset>3930015</wp:posOffset>
@@ -5804,7 +5801,7 @@
                     <pic:cNvPicPr/>
                   </pic:nvPicPr>
                   <pic:blipFill>
-                    <a:blip r:embed="rId8"/>
+                    <a:blip r:embed="rId19"/>
                     <a:stretch>
                       <a:fillRect/>
                     </a:stretch>
@@ -5840,7 +5837,7 @@
     </w:p>
     <w:tbl>
       <w:tblPr>
-        <w:tblStyle w:val="Tablaconcuadrcula"/>
+        <w:tblStyle w:val="TableGrid"/>
         <w:tblW w:w="0" w:type="auto"/>
         <w:tblBorders>
           <w:top w:val="none" w:sz="0" w:space="0" w:color="auto"/>
@@ -5959,9 +5956,9 @@
       </w:pPr>
     </w:p>
     <w:sectPr>
-      <w:headerReference w:type="even" r:id="rId9"/>
-      <w:headerReference w:type="default" r:id="rId10"/>
-      <w:footerReference w:type="default" r:id="rId11"/>
+      <w:headerReference w:type="even" r:id="rId20"/>
+      <w:headerReference w:type="default" r:id="rId21"/>
+      <w:footerReference w:type="default" r:id="rId22"/>
       <w:pgSz w:w="12240" w:h="15840" w:code="1"/>
       <w:pgMar w:top="113" w:right="1134" w:bottom="113" w:left="1701" w:header="283" w:footer="0" w:gutter="0"/>
       <w:cols w:space="708"/>
@@ -6240,7 +6237,7 @@
   </w:tbl>
   <w:p>
     <w:pPr>
-      <w:pStyle w:val="Piedepgina"/>
+      <w:pStyle w:val="Footer"/>
       <w:rPr>
         <w:rFonts w:ascii="Arial" w:hAnsi="Arial" w:cs="Arial"/>
         <w:i/>
@@ -6260,7 +6257,7 @@
   </w:p>
   <w:p>
     <w:pPr>
-      <w:pStyle w:val="Piedepgina"/>
+      <w:pStyle w:val="Footer"/>
       <w:rPr>
         <w:rFonts w:ascii="Arial" w:hAnsi="Arial" w:cs="Arial"/>
         <w:i/>
@@ -6290,7 +6287,7 @@
   </w:p>
   <w:p>
     <w:pPr>
-      <w:pStyle w:val="Piedepgina"/>
+      <w:pStyle w:val="Footer"/>
     </w:pPr>
   </w:p>
 </w:ftr>
@@ -6319,34 +6316,34 @@
 <w:hdr xmlns:wpc="http://schemas.microsoft.com/office/word/2010/wordprocessingCanvas" xmlns:cx="http://schemas.microsoft.com/office/drawing/2014/chartex" xmlns:cx1="http://schemas.microsoft.com/office/drawing/2015/9/8/chartex" xmlns:cx2="http://schemas.microsoft.com/office/drawing/2015/10/21/chartex" xmlns:cx3="http://schemas.microsoft.com/office/drawing/2016/5/9/chartex" xmlns:cx4="http://schemas.microsoft.com/office/drawing/2016/5/10/chartex" xmlns:cx5="http://schemas.microsoft.com/office/drawing/2016/5/11/chartex" xmlns:cx6="http://schemas.microsoft.com/office/drawing/2016/5/12/chartex" xmlns:cx7="http://schemas.microsoft.com/office/drawing/2016/5/13/chartex" xmlns:cx8="http://schemas.microsoft.com/office/drawing/2016/5/14/chartex" xmlns:mc="http://schemas.openxmlformats.org/markup-compatibility/2006" xmlns:aink="http://schemas.microsoft.com/office/drawing/2016/ink" xmlns:am3d="http://schemas.microsoft.com/office/drawing/2017/model3d" xmlns:o="urn:schemas-microsoft-com:office:office" xmlns:oel="http://schemas.microsoft.com/office/2019/extlst" xmlns:r="http://schemas.openxmlformats.org/officeDocument/2006/relationships" xmlns:m="http://schemas.openxmlformats.org/officeDocument/2006/math" xmlns:v="urn:schemas-microsoft-com:vml" xmlns:wp14="http://schemas.microsoft.com/office/word/2010/wordprocessingDrawing" xmlns:wp="http://schemas.openxmlformats.org/drawingml/2006/wordprocessingDrawing" xmlns:w10="urn:schemas-microsoft-com:office:word" xmlns:w="http://schemas.openxmlformats.org/wordprocessingml/2006/main" xmlns:w14="http://schemas.microsoft.com/office/word/2010/wordml" xmlns:w15="http://schemas.microsoft.com/office/word/2012/wordml" xmlns:w16cex="http://schemas.microsoft.com/office/word/2018/wordml/cex" xmlns:w16cid="http://schemas.microsoft.com/office/word/2016/wordml/cid" xmlns:w16="http://schemas.microsoft.com/office/word/2018/wordml" xmlns:w16du="http://schemas.microsoft.com/office/word/2023/wordml/word16du" xmlns:w16sdtdh="http://schemas.microsoft.com/office/word/2020/wordml/sdtdatahash" xmlns:w16sdtfl="http://schemas.microsoft.com/office/word/2024/wordml/sdtformatlock" xmlns:w16se="http://schemas.microsoft.com/office/word/2015/wordml/symex" xmlns:wpg="http://schemas.microsoft.com/office/word/2010/wordprocessingGroup" xmlns:wpi="http://schemas.microsoft.com/office/word/2010/wordprocessingInk" xmlns:wne="http://schemas.microsoft.com/office/word/2006/wordml" xmlns:wps="http://schemas.microsoft.com/office/word/2010/wordprocessingShape" mc:Ignorable="w14 w15 w16se w16cid w16 w16cex w16sdtdh w16sdtfl w16du wp14">
   <w:p>
     <w:pPr>
-      <w:pStyle w:val="Encabezado"/>
+      <w:pStyle w:val="Header"/>
       <w:framePr w:wrap="around" w:vAnchor="text" w:hAnchor="margin" w:xAlign="right" w:y="1"/>
       <w:rPr>
-        <w:rStyle w:val="Nmerodepgina"/>
+        <w:rStyle w:val="PageNumber"/>
       </w:rPr>
     </w:pPr>
     <w:r>
       <w:rPr>
-        <w:rStyle w:val="Nmerodepgina"/>
+        <w:rStyle w:val="PageNumber"/>
       </w:rPr>
       <w:fldChar w:fldCharType="begin"/>
     </w:r>
     <w:r>
       <w:rPr>
-        <w:rStyle w:val="Nmerodepgina"/>
+        <w:rStyle w:val="PageNumber"/>
       </w:rPr>
       <w:instrText xml:space="preserve">PAGE  </w:instrText>
     </w:r>
     <w:r>
       <w:rPr>
-        <w:rStyle w:val="Nmerodepgina"/>
+        <w:rStyle w:val="PageNumber"/>
       </w:rPr>
       <w:fldChar w:fldCharType="end"/>
     </w:r>
   </w:p>
   <w:p>
     <w:pPr>
-      <w:pStyle w:val="Encabezado"/>
+      <w:pStyle w:val="Header"/>
       <w:ind w:right="360"/>
     </w:pPr>
   </w:p>
@@ -6409,7 +6406,7 @@
               <w:szCs w:val="18"/>
             </w:rPr>
             <w:drawing>
-              <wp:anchor distT="0" distB="0" distL="114300" distR="114300" simplePos="0" relativeHeight="251659264" behindDoc="0" locked="0" layoutInCell="1" allowOverlap="1" wp14:anchorId="6160E46C" wp14:editId="3252801B">
+              <wp:anchor distT="0" distB="0" distL="114300" distR="114300" simplePos="0" relativeHeight="251658240" behindDoc="0" locked="0" layoutInCell="1" allowOverlap="1" wp14:anchorId="6160E46C" wp14:editId="3252801B">
                 <wp:simplePos x="0" y="0"/>
                 <wp:positionH relativeFrom="column">
                   <wp:posOffset>489585</wp:posOffset>
@@ -6835,7 +6832,7 @@
           </w:r>
           <w:r>
             <w:rPr>
-              <w:rStyle w:val="Nmerodepgina"/>
+              <w:rStyle w:val="PageNumber"/>
               <w:rFonts w:ascii="Arial" w:hAnsi="Arial" w:cs="Arial"/>
               <w:b/>
               <w:bCs/>
@@ -6845,7 +6842,7 @@
           </w:r>
           <w:r>
             <w:rPr>
-              <w:rStyle w:val="Nmerodepgina"/>
+              <w:rStyle w:val="PageNumber"/>
               <w:rFonts w:ascii="Arial" w:hAnsi="Arial" w:cs="Arial"/>
               <w:b/>
               <w:bCs/>
@@ -6855,7 +6852,7 @@
           </w:r>
           <w:r>
             <w:rPr>
-              <w:rStyle w:val="Nmerodepgina"/>
+              <w:rStyle w:val="PageNumber"/>
               <w:rFonts w:ascii="Arial" w:hAnsi="Arial" w:cs="Arial"/>
               <w:b/>
               <w:bCs/>
@@ -6865,7 +6862,7 @@
           </w:r>
           <w:r>
             <w:rPr>
-              <w:rStyle w:val="Nmerodepgina"/>
+              <w:rStyle w:val="PageNumber"/>
               <w:rFonts w:ascii="Arial" w:hAnsi="Arial" w:cs="Arial"/>
               <w:b/>
               <w:bCs/>
@@ -6875,7 +6872,7 @@
           </w:r>
           <w:r>
             <w:rPr>
-              <w:rStyle w:val="Nmerodepgina"/>
+              <w:rStyle w:val="PageNumber"/>
               <w:rFonts w:ascii="Arial" w:hAnsi="Arial" w:cs="Arial"/>
               <w:b/>
               <w:bCs/>
@@ -6885,7 +6882,7 @@
           </w:r>
           <w:r>
             <w:rPr>
-              <w:rStyle w:val="Nmerodepgina"/>
+              <w:rStyle w:val="PageNumber"/>
               <w:rFonts w:ascii="Arial" w:hAnsi="Arial" w:cs="Arial"/>
               <w:b/>
               <w:lang w:val="es-ES"/>
@@ -6894,7 +6891,7 @@
           </w:r>
           <w:r>
             <w:rPr>
-              <w:rStyle w:val="Nmerodepgina"/>
+              <w:rStyle w:val="PageNumber"/>
               <w:rFonts w:ascii="Arial" w:hAnsi="Arial" w:cs="Arial"/>
               <w:b/>
               <w:bCs/>
@@ -6904,7 +6901,7 @@
           </w:r>
           <w:r>
             <w:rPr>
-              <w:rStyle w:val="Nmerodepgina"/>
+              <w:rStyle w:val="PageNumber"/>
               <w:rFonts w:ascii="Arial" w:hAnsi="Arial" w:cs="Arial"/>
               <w:b/>
               <w:bCs/>
@@ -6914,7 +6911,7 @@
           </w:r>
           <w:r>
             <w:rPr>
-              <w:rStyle w:val="Nmerodepgina"/>
+              <w:rStyle w:val="PageNumber"/>
               <w:rFonts w:ascii="Arial" w:hAnsi="Arial" w:cs="Arial"/>
               <w:b/>
               <w:bCs/>
@@ -6924,7 +6921,7 @@
           </w:r>
           <w:r>
             <w:rPr>
-              <w:rStyle w:val="Nmerodepgina"/>
+              <w:rStyle w:val="PageNumber"/>
               <w:rFonts w:ascii="Arial" w:hAnsi="Arial" w:cs="Arial"/>
               <w:b/>
               <w:bCs/>
@@ -6934,7 +6931,7 @@
           </w:r>
           <w:r>
             <w:rPr>
-              <w:rStyle w:val="Nmerodepgina"/>
+              <w:rStyle w:val="PageNumber"/>
               <w:rFonts w:ascii="Arial" w:hAnsi="Arial" w:cs="Arial"/>
               <w:b/>
               <w:bCs/>
@@ -6948,7 +6945,7 @@
   </w:tbl>
   <w:p>
     <w:pPr>
-      <w:pStyle w:val="Encabezado"/>
+      <w:pStyle w:val="Header"/>
       <w:rPr>
         <w:rFonts w:ascii="Arial" w:hAnsi="Arial" w:cs="Arial"/>
         <w:sz w:val="2"/>
@@ -7457,12 +7454,13 @@
       <w:lang w:eastAsia="es-ES"/>
     </w:rPr>
   </w:style>
-  <w:style w:type="character" w:default="1" w:styleId="Fuentedeprrafopredeter">
+  <w:style w:type="character" w:default="1" w:styleId="DefaultParagraphFont">
     <w:name w:val="Default Paragraph Font"/>
     <w:uiPriority w:val="1"/>
+    <w:semiHidden/>
     <w:unhideWhenUsed/>
   </w:style>
-  <w:style w:type="table" w:default="1" w:styleId="Tablanormal">
+  <w:style w:type="table" w:default="1" w:styleId="TableNormal">
     <w:name w:val="Normal Table"/>
     <w:uiPriority w:val="99"/>
     <w:semiHidden/>
@@ -7477,16 +7475,16 @@
       </w:tblCellMar>
     </w:tblPr>
   </w:style>
-  <w:style w:type="numbering" w:default="1" w:styleId="Sinlista">
+  <w:style w:type="numbering" w:default="1" w:styleId="NoList">
     <w:name w:val="No List"/>
     <w:uiPriority w:val="99"/>
     <w:semiHidden/>
     <w:unhideWhenUsed/>
   </w:style>
-  <w:style w:type="paragraph" w:styleId="Encabezado">
+  <w:style w:type="paragraph" w:styleId="Header">
     <w:name w:val="header"/>
     <w:basedOn w:val="Normal"/>
-    <w:link w:val="EncabezadoCar"/>
+    <w:link w:val="HeaderChar"/>
     <w:rsid w:val="00822BBD"/>
     <w:pPr>
       <w:tabs>
@@ -7495,10 +7493,10 @@
       </w:tabs>
     </w:pPr>
   </w:style>
-  <w:style w:type="character" w:customStyle="1" w:styleId="EncabezadoCar">
-    <w:name w:val="Encabezado Car"/>
-    <w:basedOn w:val="Fuentedeprrafopredeter"/>
-    <w:link w:val="Encabezado"/>
+  <w:style w:type="character" w:customStyle="1" w:styleId="HeaderChar">
+    <w:name w:val="Header Char"/>
+    <w:basedOn w:val="DefaultParagraphFont"/>
+    <w:link w:val="Header"/>
     <w:rsid w:val="00822BBD"/>
     <w:rPr>
       <w:rFonts w:ascii="Times New Roman" w:eastAsia="Times New Roman" w:hAnsi="Times New Roman" w:cs="Times New Roman"/>
@@ -7507,15 +7505,15 @@
       <w:lang w:eastAsia="es-ES"/>
     </w:rPr>
   </w:style>
-  <w:style w:type="character" w:styleId="Nmerodepgina">
+  <w:style w:type="character" w:styleId="PageNumber">
     <w:name w:val="page number"/>
-    <w:basedOn w:val="Fuentedeprrafopredeter"/>
+    <w:basedOn w:val="DefaultParagraphFont"/>
     <w:rsid w:val="00822BBD"/>
   </w:style>
-  <w:style w:type="paragraph" w:styleId="Piedepgina">
+  <w:style w:type="paragraph" w:styleId="Footer">
     <w:name w:val="footer"/>
     <w:basedOn w:val="Normal"/>
-    <w:link w:val="PiedepginaCar"/>
+    <w:link w:val="FooterChar"/>
     <w:uiPriority w:val="99"/>
     <w:unhideWhenUsed/>
     <w:rsid w:val="00822BBD"/>
@@ -7526,10 +7524,10 @@
       </w:tabs>
     </w:pPr>
   </w:style>
-  <w:style w:type="character" w:customStyle="1" w:styleId="PiedepginaCar">
-    <w:name w:val="Pie de página Car"/>
-    <w:basedOn w:val="Fuentedeprrafopredeter"/>
-    <w:link w:val="Piedepgina"/>
+  <w:style w:type="character" w:customStyle="1" w:styleId="FooterChar">
+    <w:name w:val="Footer Char"/>
+    <w:basedOn w:val="DefaultParagraphFont"/>
+    <w:link w:val="Footer"/>
     <w:uiPriority w:val="99"/>
     <w:rsid w:val="00822BBD"/>
     <w:rPr>
@@ -7539,9 +7537,9 @@
       <w:lang w:eastAsia="es-ES"/>
     </w:rPr>
   </w:style>
-  <w:style w:type="table" w:styleId="Tablaconcuadrcula">
+  <w:style w:type="table" w:styleId="TableGrid">
     <w:name w:val="Table Grid"/>
-    <w:basedOn w:val="Tablanormal"/>
+    <w:basedOn w:val="TableNormal"/>
     <w:uiPriority w:val="39"/>
     <w:rsid w:val="00822BBD"/>
     <w:pPr>
@@ -7558,10 +7556,10 @@
       </w:tblBorders>
     </w:tblPr>
   </w:style>
-  <w:style w:type="paragraph" w:styleId="Textodeglobo">
+  <w:style w:type="paragraph" w:styleId="BalloonText">
     <w:name w:val="Balloon Text"/>
     <w:basedOn w:val="Normal"/>
-    <w:link w:val="TextodegloboCar"/>
+    <w:link w:val="BalloonTextChar"/>
     <w:uiPriority w:val="99"/>
     <w:semiHidden/>
     <w:unhideWhenUsed/>
@@ -7572,10 +7570,10 @@
       <w:szCs w:val="18"/>
     </w:rPr>
   </w:style>
-  <w:style w:type="character" w:customStyle="1" w:styleId="TextodegloboCar">
-    <w:name w:val="Texto de globo Car"/>
-    <w:basedOn w:val="Fuentedeprrafopredeter"/>
-    <w:link w:val="Textodeglobo"/>
+  <w:style w:type="character" w:customStyle="1" w:styleId="BalloonTextChar">
+    <w:name w:val="Balloon Text Char"/>
+    <w:basedOn w:val="DefaultParagraphFont"/>
+    <w:link w:val="BalloonText"/>
     <w:uiPriority w:val="99"/>
     <w:semiHidden/>
     <w:rsid w:val="0016798C"/>
@@ -7586,7 +7584,7 @@
       <w:lang w:eastAsia="es-ES"/>
     </w:rPr>
   </w:style>
-  <w:style w:type="paragraph" w:styleId="Prrafodelista">
+  <w:style w:type="paragraph" w:styleId="ListParagraph">
     <w:name w:val="List Paragraph"/>
     <w:basedOn w:val="Normal"/>
     <w:uiPriority w:val="34"/>
@@ -7604,7 +7602,7 @@
       <w:lang w:eastAsia="en-US"/>
     </w:rPr>
   </w:style>
-  <w:style w:type="paragraph" w:styleId="Descripcin">
+  <w:style w:type="paragraph" w:styleId="Caption">
     <w:name w:val="caption"/>
     <w:basedOn w:val="Normal"/>
     <w:next w:val="Normal"/>

</xml_diff>